<commit_message>
feat(report): add update_report.py script and updated report files
</commit_message>
<xml_diff>
--- a/report/report.docx
+++ b/report/report.docx
@@ -484,7 +484,7 @@
                 <w:sz w:val="21"/>
                 <w:szCs w:val="21"/>
               </w:rPr>
-              <w:t>17 April 2026 - 17 May 2026</w:t>
+              <w:t>17 April 2026 - 1 June 2026</w:t>
             </w:r>
           </w:p>
         </w:tc>
@@ -700,7 +700,7 @@
                 <w:sz w:val="21"/>
                 <w:szCs w:val="21"/>
               </w:rPr>
-              <w:t>17 May 2026</w:t>
+              <w:t>1 June 2026</w:t>
             </w:r>
           </w:p>
         </w:tc>
@@ -2914,7 +2914,7 @@
           <w:color w:val="000000"/>
           <w:lang w:val="en-US"/>
         </w:rPr>
-        <w:t>Passwords are stored in plain text in accounts.dat. There is no hashing, so anyone with file access can read all credentials directly.</w:t>
+        <w:t>Passwords are stored using salted FNV-1a hash with XOR obfuscation in accounts.dat. Each password is hashed with a unique per-account salt (10 rounds of FNV-1a), then the hash hex string is XOR-encrypted with the salt for storage. This prevents plain-text recovery: even with file access, credentials cannot be read directly.</w:t>
       </w:r>
     </w:p>
     <w:p>
@@ -2942,7 +2942,7 @@
           <w:color w:val="000000"/>
           <w:lang w:val="en-US"/>
         </w:rPr>
-        <w:t xml:space="preserve">The auto-created ADMIN account has no corresponding Member entry, causing </w:t>
+        <w:t>The default admin account (ADMIN/ADMIN) still has no Member entry, but the seed data now creates SE203055 (Nguyen Ngoc Phuc) as BCN account with full admin access and a corresponding Member record, so memberViewProfile() works correctly from BCN menu.</w:t>
       </w:r>
       <w:proofErr w:type="spellStart"/>
       <w:proofErr w:type="gramStart"/>
@@ -2951,7 +2951,6 @@
           <w:color w:val="000000"/>
           <w:lang w:val="en-US"/>
         </w:rPr>
-        <w:t>memberViewProfile</w:t>
       </w:r>
       <w:proofErr w:type="spellEnd"/>
       <w:r>
@@ -2959,7 +2958,6 @@
           <w:color w:val="000000"/>
           <w:lang w:val="en-US"/>
         </w:rPr>
-        <w:t>(</w:t>
       </w:r>
       <w:proofErr w:type="gramEnd"/>
       <w:r>
@@ -2967,7 +2965,6 @@
           <w:color w:val="000000"/>
           <w:lang w:val="en-US"/>
         </w:rPr>
-        <w:t>) to fail when accessed from the BCN menu.</w:t>
       </w:r>
     </w:p>
     <w:p>
@@ -3021,7 +3018,7 @@
         <w:rPr>
           <w:color w:val="000000"/>
         </w:rPr>
-        <w:t>The table below records the final implementation status as of 16 May 2026.</w:t>
+        <w:t>The table below records the final implementation status as of 1 June 2026.</w:t>
       </w:r>
     </w:p>
     <w:p>
@@ -3889,7 +3886,7 @@
               <w:spacing w:line="360" w:lineRule="auto"/>
             </w:pPr>
             <w:r>
-              <w:t>Default password is generated on creation</w:t>
+              <w:t>Default password = studentId; account auto-created; all edit fields re-prompt on validation failure; "0 de quay lai" supported</w:t>
             </w:r>
           </w:p>
         </w:tc>
@@ -4022,7 +4019,7 @@
               <w:spacing w:line="360" w:lineRule="auto"/>
             </w:pPr>
             <w:r>
-              <w:t>Changing role recalculates unpaid fines</w:t>
+              <w:t>Changing role recalculates unpaid fines; phone/email unique validation; name/phone/email fields wrapped in while(1) re-prompt loops</w:t>
             </w:r>
           </w:p>
         </w:tc>
@@ -4288,7 +4285,7 @@
               <w:spacing w:line="360" w:lineRule="auto"/>
             </w:pPr>
             <w:r>
-              <w:t>Member list supports pagination</w:t>
+              <w:t>Member list supports pagination (15 rows/page, n/m/q navigation); 5-column table: MSSV, Ho va ten, Email, SDT, Ban</w:t>
             </w:r>
           </w:p>
         </w:tc>
@@ -5019,7 +5016,7 @@
               <w:spacing w:line="360" w:lineRule="auto"/>
             </w:pPr>
             <w:r>
-              <w:t>Filters by team, reason, payment status</w:t>
+              <w:t>Filters by team, reason, payment status; paginated with n/m/q; "Cho dong phat" column 15 chars, status column 12 chars</w:t>
             </w:r>
           </w:p>
         </w:tc>
@@ -5640,7 +5637,7 @@
               <w:spacing w:line="360" w:lineRule="auto"/>
             </w:pPr>
             <w:r>
-              <w:t>Uses normalized day boundaries</w:t>
+              <w:t>Uses normalized day boundaries; paginated with n/m/q; start/end date wrapped in outer while(1) retry loop</w:t>
             </w:r>
           </w:p>
         </w:tc>
@@ -5795,7 +5792,7 @@
               <w:spacing w:line="360" w:lineRule="auto"/>
             </w:pPr>
             <w:r>
-              <w:t>Auto-creates ADMIN/ADMIN on first run</w:t>
+              <w:t>Auto-creates ADMIN/ADMIN on first run; fileio.c uses .tmp/.bak strategy; passwords stored with FNV-1a hash + XOR encryption</w:t>
             </w:r>
           </w:p>
         </w:tc>
@@ -6106,6 +6103,318 @@
             </w:pPr>
             <w:r>
               <w:t>Supports lookup by MSSV (exact match) or by name (case-insensitive substring). Displays a numbered selection list when multiple name matches are found.</w:t>
+            </w:r>
+          </w:p>
+        </w:tc>
+      </w:tr>
+      <w:tr>
+        <w:tc>
+          <w:tcPr>
+            <w:tcW w:type="dxa" w:w="550"/>
+          </w:tcPr>
+          <w:p>
+            <w:r>
+              <w:t>21</w:t>
+            </w:r>
+          </w:p>
+        </w:tc>
+        <w:tc>
+          <w:tcPr>
+            <w:tcW w:type="dxa" w:w="3127"/>
+          </w:tcPr>
+          <w:p>
+            <w:r>
+              <w:t>Kick (deactivate) and restore members</w:t>
+            </w:r>
+          </w:p>
+        </w:tc>
+        <w:tc>
+          <w:tcPr>
+            <w:tcW w:type="dxa" w:w="1196"/>
+          </w:tcPr>
+          <w:p>
+            <w:r>
+              <w:t>Advanced</w:t>
+            </w:r>
+          </w:p>
+        </w:tc>
+        <w:tc>
+          <w:tcPr>
+            <w:tcW w:type="dxa" w:w="1098"/>
+          </w:tcPr>
+          <w:p>
+            <w:r>
+              <w:t>Done</w:t>
+            </w:r>
+          </w:p>
+        </w:tc>
+        <w:tc>
+          <w:tcPr>
+            <w:tcW w:type="dxa" w:w="3055"/>
+          </w:tcPr>
+          <w:p>
+            <w:r>
+              <w:t>Marks member as deleted with isDeleted=1, isActive=0; preserves violations; full restore reinstates member to active status</w:t>
+            </w:r>
+          </w:p>
+        </w:tc>
+      </w:tr>
+      <w:tr>
+        <w:tc>
+          <w:tcPr>
+            <w:tcW w:type="dxa" w:w="550"/>
+          </w:tcPr>
+          <w:p>
+            <w:r>
+              <w:t>22</w:t>
+            </w:r>
+          </w:p>
+        </w:tc>
+        <w:tc>
+          <w:tcPr>
+            <w:tcW w:type="dxa" w:w="3127"/>
+          </w:tcPr>
+          <w:p>
+            <w:r>
+              <w:t>Discipline Dashboard (Out CLB tracking)</w:t>
+            </w:r>
+          </w:p>
+        </w:tc>
+        <w:tc>
+          <w:tcPr>
+            <w:tcW w:type="dxa" w:w="1196"/>
+          </w:tcPr>
+          <w:p>
+            <w:r>
+              <w:t>Advanced</w:t>
+            </w:r>
+          </w:p>
+        </w:tc>
+        <w:tc>
+          <w:tcPr>
+            <w:tcW w:type="dxa" w:w="1098"/>
+          </w:tcPr>
+          <w:p>
+            <w:r>
+              <w:t>Done</w:t>
+            </w:r>
+          </w:p>
+        </w:tc>
+        <w:tc>
+          <w:tcPr>
+            <w:tcW w:type="dxa" w:w="3055"/>
+          </w:tcPr>
+          <w:p>
+            <w:r>
+              <w:t>Shows kicked members, members near Out CLB threshold, and recent violations in a consolidated dashboard view</w:t>
+            </w:r>
+          </w:p>
+        </w:tc>
+      </w:tr>
+      <w:tr>
+        <w:tc>
+          <w:tcPr>
+            <w:tcW w:type="dxa" w:w="550"/>
+          </w:tcPr>
+          <w:p>
+            <w:r>
+              <w:t>23</w:t>
+            </w:r>
+          </w:p>
+        </w:tc>
+        <w:tc>
+          <w:tcPr>
+            <w:tcW w:type="dxa" w:w="3127"/>
+          </w:tcPr>
+          <w:p>
+            <w:r>
+              <w:t>Password hashing with FNV-1a + XOR encryption</w:t>
+            </w:r>
+          </w:p>
+        </w:tc>
+        <w:tc>
+          <w:tcPr>
+            <w:tcW w:type="dxa" w:w="1196"/>
+          </w:tcPr>
+          <w:p>
+            <w:r>
+              <w:t>Advanced</w:t>
+            </w:r>
+          </w:p>
+        </w:tc>
+        <w:tc>
+          <w:tcPr>
+            <w:tcW w:type="dxa" w:w="1098"/>
+          </w:tcPr>
+          <w:p>
+            <w:r>
+              <w:t>Done</w:t>
+            </w:r>
+          </w:p>
+        </w:tc>
+        <w:tc>
+          <w:tcPr>
+            <w:tcW w:type="dxa" w:w="3055"/>
+          </w:tcPr>
+          <w:p>
+            <w:r>
+              <w:t>Salted FNV-1a hash with 10 rounds; per-account random salt; XOR encryption of hash hex string; prevents plain-text recovery</w:t>
+            </w:r>
+          </w:p>
+        </w:tc>
+      </w:tr>
+      <w:tr>
+        <w:tc>
+          <w:tcPr>
+            <w:tcW w:type="dxa" w:w="550"/>
+          </w:tcPr>
+          <w:p>
+            <w:r>
+              <w:t>24</w:t>
+            </w:r>
+          </w:p>
+        </w:tc>
+        <w:tc>
+          <w:tcPr>
+            <w:tcW w:type="dxa" w:w="3127"/>
+          </w:tcPr>
+          <w:p>
+            <w:r>
+              <w:t>Input validation enhancements</w:t>
+            </w:r>
+          </w:p>
+        </w:tc>
+        <w:tc>
+          <w:tcPr>
+            <w:tcW w:type="dxa" w:w="1196"/>
+          </w:tcPr>
+          <w:p>
+            <w:r>
+              <w:t>Required</w:t>
+            </w:r>
+          </w:p>
+        </w:tc>
+        <w:tc>
+          <w:tcPr>
+            <w:tcW w:type="dxa" w:w="1098"/>
+          </w:tcPr>
+          <w:p>
+            <w:r>
+              <w:t>Done</w:t>
+            </w:r>
+          </w:p>
+        </w:tc>
+        <w:tc>
+          <w:tcPr>
+            <w:tcW w:type="dxa" w:w="3055"/>
+          </w:tcPr>
+          <w:p>
+            <w:r>
+              <w:t>Email: rejects commas, invalid TLD chars, dots at start/end, consecutive dots; enforces min 2-letter TLD. Phone: unique validation. All edit fields re-prompt on failure</w:t>
+            </w:r>
+          </w:p>
+        </w:tc>
+      </w:tr>
+      <w:tr>
+        <w:tc>
+          <w:tcPr>
+            <w:tcW w:type="dxa" w:w="550"/>
+          </w:tcPr>
+          <w:p>
+            <w:r>
+              <w:t>25</w:t>
+            </w:r>
+          </w:p>
+        </w:tc>
+        <w:tc>
+          <w:tcPr>
+            <w:tcW w:type="dxa" w:w="3127"/>
+          </w:tcPr>
+          <w:p>
+            <w:r>
+              <w:t>"0 de quay lai" (zero to go back) on MSSV prompts</w:t>
+            </w:r>
+          </w:p>
+        </w:tc>
+        <w:tc>
+          <w:tcPr>
+            <w:tcW w:type="dxa" w:w="1196"/>
+          </w:tcPr>
+          <w:p>
+            <w:r>
+              <w:t>Required</w:t>
+            </w:r>
+          </w:p>
+        </w:tc>
+        <w:tc>
+          <w:tcPr>
+            <w:tcW w:type="dxa" w:w="1098"/>
+          </w:tcPr>
+          <w:p>
+            <w:r>
+              <w:t>Done</w:t>
+            </w:r>
+          </w:p>
+        </w:tc>
+        <w:tc>
+          <w:tcPr>
+            <w:tcW w:type="dxa" w:w="3055"/>
+          </w:tcPr>
+          <w:p>
+            <w:r>
+              <w:t>All student ID prompts support entering 0 to cancel and return to previous menu; implemented in member/violation operations</w:t>
+            </w:r>
+          </w:p>
+        </w:tc>
+      </w:tr>
+      <w:tr>
+        <w:tc>
+          <w:tcPr>
+            <w:tcW w:type="dxa" w:w="550"/>
+          </w:tcPr>
+          <w:p>
+            <w:r>
+              <w:t>26</w:t>
+            </w:r>
+          </w:p>
+        </w:tc>
+        <w:tc>
+          <w:tcPr>
+            <w:tcW w:type="dxa" w:w="3127"/>
+          </w:tcPr>
+          <w:p>
+            <w:r>
+              <w:t>Pagination across list views</w:t>
+            </w:r>
+          </w:p>
+        </w:tc>
+        <w:tc>
+          <w:tcPr>
+            <w:tcW w:type="dxa" w:w="1196"/>
+          </w:tcPr>
+          <w:p>
+            <w:r>
+              <w:t>Advanced</w:t>
+            </w:r>
+          </w:p>
+        </w:tc>
+        <w:tc>
+          <w:tcPr>
+            <w:tcW w:type="dxa" w:w="1098"/>
+          </w:tcPr>
+          <w:p>
+            <w:r>
+              <w:t>Done</w:t>
+            </w:r>
+          </w:p>
+        </w:tc>
+        <w:tc>
+          <w:tcPr>
+            <w:tcW w:type="dxa" w:w="3055"/>
+          </w:tcPr>
+          <w:p>
+            <w:r>
+              <w:t>Member list, violation view (all/filtered), and date search use consistent clear-screen paging: 15 rows/page, n/m/q navigation</w:t>
             </w:r>
           </w:p>
         </w:tc>
@@ -7145,7 +7454,7 @@
               <w:spacing w:line="360" w:lineRule="auto"/>
             </w:pPr>
             <w:r>
-              <w:t>Central definitions for Account, Member, Violation, AppDatabase, constants, and capacity limits.</w:t>
+              <w:t>Standalone generator for deterministic seed data: 72 members (70 real Challenge 3 students + SE203055 + ADMIN), 72 accounts, 76 violations, 3 kicked members, 1 OUT_CLB case.</w:t>
             </w:r>
           </w:p>
         </w:tc>
@@ -7214,7 +7523,7 @@
               </w:rPr>
             </w:pPr>
             <w:r>
-              <w:t>Standalone generator for predictable demo data and reset flow.</w:t>
+              <w:t>Repository-level binary seed files: accounts.dat, members.dat, violations.dat with real data.</w:t>
             </w:r>
           </w:p>
         </w:tc>
@@ -7422,6 +7731,50 @@
             </w:pPr>
             <w:r>
               <w:t>Requirement documents, architecture notes, demo guide, technical highlights, stories, and reports.</w:t>
+            </w:r>
+          </w:p>
+        </w:tc>
+      </w:tr>
+      <w:tr>
+        <w:tc>
+          <w:tcPr>
+            <w:tcW w:type="dxa" w:w="2400"/>
+          </w:tcPr>
+          <w:p>
+            <w:r>
+              <w:t>run.bat</w:t>
+            </w:r>
+          </w:p>
+        </w:tc>
+        <w:tc>
+          <w:tcPr>
+            <w:tcW w:type="dxa" w:w="6626"/>
+          </w:tcPr>
+          <w:p>
+            <w:r>
+              <w:t>One-click build-and-run script. Calls mingw32-make, compiles seed_data.exe, runs seed, then launches the application.</w:t>
+            </w:r>
+          </w:p>
+        </w:tc>
+      </w:tr>
+      <w:tr>
+        <w:tc>
+          <w:tcPr>
+            <w:tcW w:type="dxa" w:w="2400"/>
+          </w:tcPr>
+          <w:p>
+            <w:r>
+              <w:t>report/</w:t>
+            </w:r>
+          </w:p>
+        </w:tc>
+        <w:tc>
+          <w:tcPr>
+            <w:tcW w:type="dxa" w:w="6626"/>
+          </w:tcPr>
+          <w:p>
+            <w:r>
+              <w:t>Defense report template (report.docx) and update script.</w:t>
             </w:r>
           </w:p>
         </w:tc>
@@ -7561,7 +7914,7 @@
           <w:color w:val="000000"/>
           <w:lang w:val="en-US"/>
         </w:rPr>
-        <w:t>The repository includes both engineering documents (architecture.md, epics.md, story files) and operational documents (demo-and-test-guide.md, technical-highlights.md) that support implementation and defense.</w:t>
+        <w:t>The repository includes both engineering documents (architecture.md, epics.md, story files), operational documents (demo-and-test-guide.md, technical_updates.md), and a defense report (report/report.docx).</w:t>
       </w:r>
     </w:p>
     <w:p>
@@ -8149,7 +8502,7 @@
               <w:spacing w:line="360" w:lineRule="auto"/>
             </w:pPr>
             <w:r>
-              <w:t>Plain-text password stored in the current implementation.</w:t>
+              <w:t>Salted FNV-1a hash (10 rounds) with per-account random salt, XOR-encrypted with the salt for storage. Not recoverable as plain text.</w:t>
             </w:r>
           </w:p>
         </w:tc>
@@ -12540,6 +12893,66 @@
       </w:r>
     </w:p>
     <w:p>
+      <w:pPr/>
+      <w:r/>
+    </w:p>
+    <w:p>
+      <w:pPr>
+        <w:pStyle w:val="Heading3"/>
+      </w:pPr>
+      <w:r>
+        <w:t>3.3.10.  Password hashing with FNV-1a + XOR encryption</w:t>
+      </w:r>
+    </w:p>
+    <w:p>
+      <w:pPr/>
+      <w:r>
+        <w:t>Passwords are not stored as plain text. The auth module hashes each password using FNV-1a (Fowler-Noll-Vo) hash with a per-account random salt. The hash undergoes 10 rounds of FNV-1a with the salt XOR-mixed at each round. The final 64-bit hash is converted to a hex string, then XOR-encrypted with the salt bytes for storage. On login, the stored salt is used to recompute the hash from the entered password and compare against the stored obfuscated value. This ensures that even if accounts.dat is compromised, passwords cannot be recovered as plain text.</w:t>
+      </w:r>
+    </w:p>
+    <w:p>
+      <w:pPr>
+        <w:pStyle w:val="Heading3"/>
+      </w:pPr>
+      <w:r>
+        <w:t>3.3.11.  Member kick (deactivation) and restore</w:t>
+      </w:r>
+    </w:p>
+    <w:p>
+      <w:pPr/>
+      <w:r>
+        <w:t>The system supports soft-deactivation of members through a kick operation. Kicking a member sets isDeleted=1, isActive=0, records a deletedAt timestamp, and preserves all violation history. The corresponding account is locked to prevent login. Restore reverses the operation: sets isDeleted=0, isActive=1, clears deletedAt, and unlocks the account. This allows the club to track former members without permanently removing their records. The discipline dashboard provides visibility into currently kicked members.</w:t>
+      </w:r>
+    </w:p>
+    <w:p>
+      <w:pPr>
+        <w:pStyle w:val="Heading3"/>
+      </w:pPr>
+      <w:r>
+        <w:t>3.3.12.  Input validation and re-prompt loops</w:t>
+      </w:r>
+    </w:p>
+    <w:p>
+      <w:pPr/>
+      <w:r>
+        <w:t>All mutation operations use defensive while(1) loops that re-prompt on validation failure. If the user presses Enter without input, the existing value is kept. If input is invalid, an error message is shown and the prompt repeats. All student ID prompts support "0 de quay lai" (zero to go back) to cancel the operation and return to the previous menu. Email validation is particularly strict: it rejects commas, invalid TLD characters, dots at the start or end of the local part, consecutive dots, and enforces a minimum 2-letter TLD. Phone numbers are normalized to 10 digits and checked for uniqueness.</w:t>
+      </w:r>
+    </w:p>
+    <w:p>
+      <w:pPr>
+        <w:pStyle w:val="Heading3"/>
+      </w:pPr>
+      <w:r>
+        <w:t>3.3.13.  Pagination for list views</w:t>
+      </w:r>
+    </w:p>
+    <w:p>
+      <w:pPr/>
+      <w:r>
+        <w:t>Member list, violation view (all/filtered), and date search all use a consistent pagination system. Each view displays 15 rows per page (ROWS_PER_PAGE from include/ui.h). The user navigates with n (next page), m (previous page), and q (quit back to menu). The screen is cleared between pages for clean presentation. Violation list uses a two-pass approach: the first pass collects matching indices into a matchIdx[] array, and the second pass renders the current page from that index array.</w:t>
+      </w:r>
+    </w:p>
+    <w:p>
       <w:pPr>
         <w:spacing w:before="80" w:after="80" w:line="360" w:lineRule="auto"/>
         <w:jc w:val="both"/>
@@ -12742,26 +13155,9 @@
       <w:tr>
         <w:tc>
           <w:tcPr>
-            <w:tcW w:w="637" w:type="dxa"/>
-            <w:tcBorders>
-              <w:top w:val="single" w:sz="4" w:space="0" w:color="D9D9D9"/>
-              <w:left w:val="single" w:sz="4" w:space="0" w:color="D9D9D9"/>
-              <w:bottom w:val="single" w:sz="4" w:space="0" w:color="D9D9D9"/>
-              <w:right w:val="single" w:sz="4" w:space="0" w:color="D9D9D9"/>
-            </w:tcBorders>
-            <w:shd w:val="clear" w:color="auto" w:fill="F2F2F2"/>
-            <w:tcMar>
-              <w:top w:w="80" w:type="dxa"/>
-              <w:left w:w="140" w:type="dxa"/>
-              <w:bottom w:w="80" w:type="dxa"/>
-              <w:right w:w="100" w:type="dxa"/>
-            </w:tcMar>
-          </w:tcPr>
-          <w:p>
-            <w:pPr>
-              <w:spacing w:line="360" w:lineRule="auto"/>
-              <w:jc w:val="center"/>
-            </w:pPr>
+            <w:tcW w:type="dxa" w:w="637"/>
+          </w:tcPr>
+          <w:p>
             <w:r>
               <w:t>1</w:t>
             </w:r>
@@ -12769,25 +13165,9 @@
         </w:tc>
         <w:tc>
           <w:tcPr>
-            <w:tcW w:w="2173" w:type="dxa"/>
-            <w:tcBorders>
-              <w:top w:val="single" w:sz="4" w:space="0" w:color="D9D9D9"/>
-              <w:left w:val="single" w:sz="4" w:space="0" w:color="D9D9D9"/>
-              <w:bottom w:val="single" w:sz="4" w:space="0" w:color="D9D9D9"/>
-              <w:right w:val="single" w:sz="4" w:space="0" w:color="D9D9D9"/>
-            </w:tcBorders>
-            <w:shd w:val="clear" w:color="auto" w:fill="F2F2F2"/>
-            <w:tcMar>
-              <w:top w:w="80" w:type="dxa"/>
-              <w:left w:w="140" w:type="dxa"/>
-              <w:bottom w:w="80" w:type="dxa"/>
-              <w:right w:w="100" w:type="dxa"/>
-            </w:tcMar>
-          </w:tcPr>
-          <w:p>
-            <w:pPr>
-              <w:spacing w:line="360" w:lineRule="auto"/>
-            </w:pPr>
+            <w:tcW w:type="dxa" w:w="2173"/>
+          </w:tcPr>
+          <w:p>
             <w:r>
               <w:t>Build and seed data</w:t>
             </w:r>
@@ -12795,26 +13175,11 @@
         </w:tc>
         <w:tc>
           <w:tcPr>
-            <w:tcW w:w="6216" w:type="dxa"/>
-            <w:tcBorders>
-              <w:top w:val="single" w:sz="4" w:space="0" w:color="D9D9D9"/>
-              <w:left w:val="single" w:sz="4" w:space="0" w:color="D9D9D9"/>
-              <w:bottom w:val="single" w:sz="4" w:space="0" w:color="D9D9D9"/>
-              <w:right w:val="single" w:sz="4" w:space="0" w:color="D9D9D9"/>
-            </w:tcBorders>
-            <w:tcMar>
-              <w:top w:w="80" w:type="dxa"/>
-              <w:left w:w="140" w:type="dxa"/>
-              <w:bottom w:w="80" w:type="dxa"/>
-              <w:right w:w="100" w:type="dxa"/>
-            </w:tcMar>
-          </w:tcPr>
-          <w:p>
-            <w:pPr>
-              <w:spacing w:line="360" w:lineRule="auto"/>
-            </w:pPr>
-            <w:r>
-              <w:t>Run mingw32-make, then run bin\seed_data.exe. Show that demo data is created in bin\data\.</w:t>
+            <w:tcW w:type="dxa" w:w="6216"/>
+          </w:tcPr>
+          <w:p>
+            <w:r>
+              <w:t>Run mingw32-make, then run bin\seed_data.exe or use run.bat</w:t>
             </w:r>
           </w:p>
         </w:tc>
@@ -12822,26 +13187,9 @@
       <w:tr>
         <w:tc>
           <w:tcPr>
-            <w:tcW w:w="637" w:type="dxa"/>
-            <w:tcBorders>
-              <w:top w:val="single" w:sz="4" w:space="0" w:color="D9D9D9"/>
-              <w:left w:val="single" w:sz="4" w:space="0" w:color="D9D9D9"/>
-              <w:bottom w:val="single" w:sz="4" w:space="0" w:color="D9D9D9"/>
-              <w:right w:val="single" w:sz="4" w:space="0" w:color="D9D9D9"/>
-            </w:tcBorders>
-            <w:shd w:val="clear" w:color="auto" w:fill="F2F2F2"/>
-            <w:tcMar>
-              <w:top w:w="80" w:type="dxa"/>
-              <w:left w:w="140" w:type="dxa"/>
-              <w:bottom w:w="80" w:type="dxa"/>
-              <w:right w:w="100" w:type="dxa"/>
-            </w:tcMar>
-          </w:tcPr>
-          <w:p>
-            <w:pPr>
-              <w:spacing w:line="360" w:lineRule="auto"/>
-              <w:jc w:val="center"/>
-            </w:pPr>
+            <w:tcW w:type="dxa" w:w="637"/>
+          </w:tcPr>
+          <w:p>
             <w:r>
               <w:t>2</w:t>
             </w:r>
@@ -12849,25 +13197,9 @@
         </w:tc>
         <w:tc>
           <w:tcPr>
-            <w:tcW w:w="2173" w:type="dxa"/>
-            <w:tcBorders>
-              <w:top w:val="single" w:sz="4" w:space="0" w:color="D9D9D9"/>
-              <w:left w:val="single" w:sz="4" w:space="0" w:color="D9D9D9"/>
-              <w:bottom w:val="single" w:sz="4" w:space="0" w:color="D9D9D9"/>
-              <w:right w:val="single" w:sz="4" w:space="0" w:color="D9D9D9"/>
-            </w:tcBorders>
-            <w:shd w:val="clear" w:color="auto" w:fill="F2F2F2"/>
-            <w:tcMar>
-              <w:top w:w="80" w:type="dxa"/>
-              <w:left w:w="140" w:type="dxa"/>
-              <w:bottom w:w="80" w:type="dxa"/>
-              <w:right w:w="100" w:type="dxa"/>
-            </w:tcMar>
-          </w:tcPr>
-          <w:p>
-            <w:pPr>
-              <w:spacing w:line="360" w:lineRule="auto"/>
-            </w:pPr>
+            <w:tcW w:type="dxa" w:w="2173"/>
+          </w:tcPr>
+          <w:p>
             <w:r>
               <w:t>Program startup</w:t>
             </w:r>
@@ -12875,26 +13207,11 @@
         </w:tc>
         <w:tc>
           <w:tcPr>
-            <w:tcW w:w="6216" w:type="dxa"/>
-            <w:tcBorders>
-              <w:top w:val="single" w:sz="4" w:space="0" w:color="D9D9D9"/>
-              <w:left w:val="single" w:sz="4" w:space="0" w:color="D9D9D9"/>
-              <w:bottom w:val="single" w:sz="4" w:space="0" w:color="D9D9D9"/>
-              <w:right w:val="single" w:sz="4" w:space="0" w:color="D9D9D9"/>
-            </w:tcBorders>
-            <w:tcMar>
-              <w:top w:w="80" w:type="dxa"/>
-              <w:left w:w="140" w:type="dxa"/>
-              <w:bottom w:w="80" w:type="dxa"/>
-              <w:right w:w="100" w:type="dxa"/>
-            </w:tcMar>
-          </w:tcPr>
-          <w:p>
-            <w:pPr>
-              <w:spacing w:line="360" w:lineRule="auto"/>
-            </w:pPr>
-            <w:r>
-              <w:t>Run bin\\violation-management-system.exe. The program loads members, violations, and accounts successfully.</w:t>
+            <w:tcW w:type="dxa" w:w="6216"/>
+          </w:tcPr>
+          <w:p>
+            <w:r>
+              <w:t>Run bin\violation-management-system.exe. Login screen appears.</w:t>
             </w:r>
           </w:p>
         </w:tc>
@@ -12902,26 +13219,9 @@
       <w:tr>
         <w:tc>
           <w:tcPr>
-            <w:tcW w:w="637" w:type="dxa"/>
-            <w:tcBorders>
-              <w:top w:val="single" w:sz="4" w:space="0" w:color="D9D9D9"/>
-              <w:left w:val="single" w:sz="4" w:space="0" w:color="D9D9D9"/>
-              <w:bottom w:val="single" w:sz="4" w:space="0" w:color="D9D9D9"/>
-              <w:right w:val="single" w:sz="4" w:space="0" w:color="D9D9D9"/>
-            </w:tcBorders>
-            <w:shd w:val="clear" w:color="auto" w:fill="F2F2F2"/>
-            <w:tcMar>
-              <w:top w:w="80" w:type="dxa"/>
-              <w:left w:w="140" w:type="dxa"/>
-              <w:bottom w:w="80" w:type="dxa"/>
-              <w:right w:w="100" w:type="dxa"/>
-            </w:tcMar>
-          </w:tcPr>
-          <w:p>
-            <w:pPr>
-              <w:spacing w:line="360" w:lineRule="auto"/>
-              <w:jc w:val="center"/>
-            </w:pPr>
+            <w:tcW w:type="dxa" w:w="637"/>
+          </w:tcPr>
+          <w:p>
             <w:r>
               <w:t>3</w:t>
             </w:r>
@@ -12929,52 +13229,21 @@
         </w:tc>
         <w:tc>
           <w:tcPr>
-            <w:tcW w:w="2173" w:type="dxa"/>
-            <w:tcBorders>
-              <w:top w:val="single" w:sz="4" w:space="0" w:color="D9D9D9"/>
-              <w:left w:val="single" w:sz="4" w:space="0" w:color="D9D9D9"/>
-              <w:bottom w:val="single" w:sz="4" w:space="0" w:color="D9D9D9"/>
-              <w:right w:val="single" w:sz="4" w:space="0" w:color="D9D9D9"/>
-            </w:tcBorders>
-            <w:shd w:val="clear" w:color="auto" w:fill="F2F2F2"/>
-            <w:tcMar>
-              <w:top w:w="80" w:type="dxa"/>
-              <w:left w:w="140" w:type="dxa"/>
-              <w:bottom w:w="80" w:type="dxa"/>
-              <w:right w:w="100" w:type="dxa"/>
-            </w:tcMar>
-          </w:tcPr>
-          <w:p>
-            <w:pPr>
-              <w:spacing w:line="360" w:lineRule="auto"/>
-            </w:pPr>
-            <w:r>
-              <w:t>Admin login</w:t>
-            </w:r>
-          </w:p>
-        </w:tc>
-        <w:tc>
-          <w:tcPr>
-            <w:tcW w:w="6216" w:type="dxa"/>
-            <w:tcBorders>
-              <w:top w:val="single" w:sz="4" w:space="0" w:color="D9D9D9"/>
-              <w:left w:val="single" w:sz="4" w:space="0" w:color="D9D9D9"/>
-              <w:bottom w:val="single" w:sz="4" w:space="0" w:color="D9D9D9"/>
-              <w:right w:val="single" w:sz="4" w:space="0" w:color="D9D9D9"/>
-            </w:tcBorders>
-            <w:tcMar>
-              <w:top w:w="80" w:type="dxa"/>
-              <w:left w:w="140" w:type="dxa"/>
-              <w:bottom w:w="80" w:type="dxa"/>
-              <w:right w:w="100" w:type="dxa"/>
-            </w:tcMar>
-          </w:tcPr>
-          <w:p>
-            <w:pPr>
-              <w:spacing w:line="360" w:lineRule="auto"/>
-            </w:pPr>
-            <w:r>
-              <w:t>Login with ADMIN / ADMIN. The system routes to the BCN menu with 15 functions.</w:t>
+            <w:tcW w:type="dxa" w:w="2173"/>
+          </w:tcPr>
+          <w:p>
+            <w:r>
+              <w:t>Admin login (BCN)</w:t>
+            </w:r>
+          </w:p>
+        </w:tc>
+        <w:tc>
+          <w:tcPr>
+            <w:tcW w:type="dxa" w:w="6216"/>
+          </w:tcPr>
+          <w:p>
+            <w:r>
+              <w:t>Login with SE203055 / Phuc@2006 (BCN role). The BCN menu shows all management options including member CRUD, violation recording, kick/restore.</w:t>
             </w:r>
           </w:p>
         </w:tc>
@@ -12982,26 +13251,9 @@
       <w:tr>
         <w:tc>
           <w:tcPr>
-            <w:tcW w:w="637" w:type="dxa"/>
-            <w:tcBorders>
-              <w:top w:val="single" w:sz="4" w:space="0" w:color="D9D9D9"/>
-              <w:left w:val="single" w:sz="4" w:space="0" w:color="D9D9D9"/>
-              <w:bottom w:val="single" w:sz="4" w:space="0" w:color="D9D9D9"/>
-              <w:right w:val="single" w:sz="4" w:space="0" w:color="D9D9D9"/>
-            </w:tcBorders>
-            <w:shd w:val="clear" w:color="auto" w:fill="F2F2F2"/>
-            <w:tcMar>
-              <w:top w:w="80" w:type="dxa"/>
-              <w:left w:w="140" w:type="dxa"/>
-              <w:bottom w:w="80" w:type="dxa"/>
-              <w:right w:w="100" w:type="dxa"/>
-            </w:tcMar>
-          </w:tcPr>
-          <w:p>
-            <w:pPr>
-              <w:spacing w:line="360" w:lineRule="auto"/>
-              <w:jc w:val="center"/>
-            </w:pPr>
+            <w:tcW w:type="dxa" w:w="637"/>
+          </w:tcPr>
+          <w:p>
             <w:r>
               <w:t>4</w:t>
             </w:r>
@@ -13009,25 +13261,9 @@
         </w:tc>
         <w:tc>
           <w:tcPr>
-            <w:tcW w:w="2173" w:type="dxa"/>
-            <w:tcBorders>
-              <w:top w:val="single" w:sz="4" w:space="0" w:color="D9D9D9"/>
-              <w:left w:val="single" w:sz="4" w:space="0" w:color="D9D9D9"/>
-              <w:bottom w:val="single" w:sz="4" w:space="0" w:color="D9D9D9"/>
-              <w:right w:val="single" w:sz="4" w:space="0" w:color="D9D9D9"/>
-            </w:tcBorders>
-            <w:shd w:val="clear" w:color="auto" w:fill="F2F2F2"/>
-            <w:tcMar>
-              <w:top w:w="80" w:type="dxa"/>
-              <w:left w:w="140" w:type="dxa"/>
-              <w:bottom w:w="80" w:type="dxa"/>
-              <w:right w:w="100" w:type="dxa"/>
-            </w:tcMar>
-          </w:tcPr>
-          <w:p>
-            <w:pPr>
-              <w:spacing w:line="360" w:lineRule="auto"/>
-            </w:pPr>
+            <w:tcW w:type="dxa" w:w="2173"/>
+          </w:tcPr>
+          <w:p>
             <w:r>
               <w:t>View member list</w:t>
             </w:r>
@@ -13035,26 +13271,11 @@
         </w:tc>
         <w:tc>
           <w:tcPr>
-            <w:tcW w:w="6216" w:type="dxa"/>
-            <w:tcBorders>
-              <w:top w:val="single" w:sz="4" w:space="0" w:color="D9D9D9"/>
-              <w:left w:val="single" w:sz="4" w:space="0" w:color="D9D9D9"/>
-              <w:bottom w:val="single" w:sz="4" w:space="0" w:color="D9D9D9"/>
-              <w:right w:val="single" w:sz="4" w:space="0" w:color="D9D9D9"/>
-            </w:tcBorders>
-            <w:tcMar>
-              <w:top w:w="80" w:type="dxa"/>
-              <w:left w:w="140" w:type="dxa"/>
-              <w:bottom w:w="80" w:type="dxa"/>
-              <w:right w:w="100" w:type="dxa"/>
-            </w:tcMar>
-          </w:tcPr>
-          <w:p>
-            <w:pPr>
-              <w:spacing w:line="360" w:lineRule="auto"/>
-            </w:pPr>
-            <w:r>
-              <w:t>Choose option 13. Show the club member table, team names, roles, and status values. The seeded dataset contains 14 members plus the synthetic ADMIN account.</w:t>
+            <w:tcW w:type="dxa" w:w="6216"/>
+          </w:tcPr>
+          <w:p>
+            <w:r>
+              <w:t>Choose option 13. Shows 5-column table (MSSV, Ho va ten, Email, SDT, Ban) with pagination. Use n=next page, m=previous page, q=quit.</w:t>
             </w:r>
           </w:p>
         </w:tc>
@@ -13062,26 +13283,9 @@
       <w:tr>
         <w:tc>
           <w:tcPr>
-            <w:tcW w:w="637" w:type="dxa"/>
-            <w:tcBorders>
-              <w:top w:val="single" w:sz="4" w:space="0" w:color="D9D9D9"/>
-              <w:left w:val="single" w:sz="4" w:space="0" w:color="D9D9D9"/>
-              <w:bottom w:val="single" w:sz="4" w:space="0" w:color="D9D9D9"/>
-              <w:right w:val="single" w:sz="4" w:space="0" w:color="D9D9D9"/>
-            </w:tcBorders>
-            <w:shd w:val="clear" w:color="auto" w:fill="F2F2F2"/>
-            <w:tcMar>
-              <w:top w:w="80" w:type="dxa"/>
-              <w:left w:w="140" w:type="dxa"/>
-              <w:bottom w:w="80" w:type="dxa"/>
-              <w:right w:w="100" w:type="dxa"/>
-            </w:tcMar>
-          </w:tcPr>
-          <w:p>
-            <w:pPr>
-              <w:spacing w:line="360" w:lineRule="auto"/>
-              <w:jc w:val="center"/>
-            </w:pPr>
+            <w:tcW w:type="dxa" w:w="637"/>
+          </w:tcPr>
+          <w:p>
             <w:r>
               <w:t>5</w:t>
             </w:r>
@@ -13089,25 +13293,9 @@
         </w:tc>
         <w:tc>
           <w:tcPr>
-            <w:tcW w:w="2173" w:type="dxa"/>
-            <w:tcBorders>
-              <w:top w:val="single" w:sz="4" w:space="0" w:color="D9D9D9"/>
-              <w:left w:val="single" w:sz="4" w:space="0" w:color="D9D9D9"/>
-              <w:bottom w:val="single" w:sz="4" w:space="0" w:color="D9D9D9"/>
-              <w:right w:val="single" w:sz="4" w:space="0" w:color="D9D9D9"/>
-            </w:tcBorders>
-            <w:shd w:val="clear" w:color="auto" w:fill="F2F2F2"/>
-            <w:tcMar>
-              <w:top w:w="80" w:type="dxa"/>
-              <w:left w:w="140" w:type="dxa"/>
-              <w:bottom w:w="80" w:type="dxa"/>
-              <w:right w:w="100" w:type="dxa"/>
-            </w:tcMar>
-          </w:tcPr>
-          <w:p>
-            <w:pPr>
-              <w:spacing w:line="360" w:lineRule="auto"/>
-            </w:pPr>
+            <w:tcW w:type="dxa" w:w="2173"/>
+          </w:tcPr>
+          <w:p>
             <w:r>
               <w:t>Add a new member</w:t>
             </w:r>
@@ -13115,26 +13303,11 @@
         </w:tc>
         <w:tc>
           <w:tcPr>
-            <w:tcW w:w="6216" w:type="dxa"/>
-            <w:tcBorders>
-              <w:top w:val="single" w:sz="4" w:space="0" w:color="D9D9D9"/>
-              <w:left w:val="single" w:sz="4" w:space="0" w:color="D9D9D9"/>
-              <w:bottom w:val="single" w:sz="4" w:space="0" w:color="D9D9D9"/>
-              <w:right w:val="single" w:sz="4" w:space="0" w:color="D9D9D9"/>
-            </w:tcBorders>
-            <w:tcMar>
-              <w:top w:w="80" w:type="dxa"/>
-              <w:left w:w="140" w:type="dxa"/>
-              <w:bottom w:w="80" w:type="dxa"/>
-              <w:right w:w="100" w:type="dxa"/>
-            </w:tcMar>
-          </w:tcPr>
-          <w:p>
-            <w:pPr>
-              <w:spacing w:line="360" w:lineRule="auto"/>
-            </w:pPr>
-            <w:r>
-              <w:t>Choose option 1, enter a test member such as SV0099, and show automatic account creation plus immediate file save.</w:t>
+            <w:tcW w:type="dxa" w:w="6216"/>
+          </w:tcPr>
+          <w:p>
+            <w:r>
+              <w:t>Choose option 1, enter a test student ID (e.g., SE209999). All fields validated; invalid input re-prompts until corrected. Enter 0 at MSSV prompt to cancel.</w:t>
             </w:r>
           </w:p>
         </w:tc>
@@ -13142,26 +13315,9 @@
       <w:tr>
         <w:tc>
           <w:tcPr>
-            <w:tcW w:w="637" w:type="dxa"/>
-            <w:tcBorders>
-              <w:top w:val="single" w:sz="4" w:space="0" w:color="D9D9D9"/>
-              <w:left w:val="single" w:sz="4" w:space="0" w:color="D9D9D9"/>
-              <w:bottom w:val="single" w:sz="4" w:space="0" w:color="D9D9D9"/>
-              <w:right w:val="single" w:sz="4" w:space="0" w:color="D9D9D9"/>
-            </w:tcBorders>
-            <w:shd w:val="clear" w:color="auto" w:fill="F2F2F2"/>
-            <w:tcMar>
-              <w:top w:w="80" w:type="dxa"/>
-              <w:left w:w="140" w:type="dxa"/>
-              <w:bottom w:w="80" w:type="dxa"/>
-              <w:right w:w="100" w:type="dxa"/>
-            </w:tcMar>
-          </w:tcPr>
-          <w:p>
-            <w:pPr>
-              <w:spacing w:line="360" w:lineRule="auto"/>
-              <w:jc w:val="center"/>
-            </w:pPr>
+            <w:tcW w:type="dxa" w:w="637"/>
+          </w:tcPr>
+          <w:p>
             <w:r>
               <w:t>6</w:t>
             </w:r>
@@ -13169,52 +13325,21 @@
         </w:tc>
         <w:tc>
           <w:tcPr>
-            <w:tcW w:w="2173" w:type="dxa"/>
-            <w:tcBorders>
-              <w:top w:val="single" w:sz="4" w:space="0" w:color="D9D9D9"/>
-              <w:left w:val="single" w:sz="4" w:space="0" w:color="D9D9D9"/>
-              <w:bottom w:val="single" w:sz="4" w:space="0" w:color="D9D9D9"/>
-              <w:right w:val="single" w:sz="4" w:space="0" w:color="D9D9D9"/>
-            </w:tcBorders>
-            <w:shd w:val="clear" w:color="auto" w:fill="F2F2F2"/>
-            <w:tcMar>
-              <w:top w:w="80" w:type="dxa"/>
-              <w:left w:w="140" w:type="dxa"/>
-              <w:bottom w:w="80" w:type="dxa"/>
-              <w:right w:w="100" w:type="dxa"/>
-            </w:tcMar>
-          </w:tcPr>
-          <w:p>
-            <w:pPr>
-              <w:spacing w:line="360" w:lineRule="auto"/>
-            </w:pPr>
-            <w:r>
-              <w:t>Record a normal violation</w:t>
-            </w:r>
-          </w:p>
-        </w:tc>
-        <w:tc>
-          <w:tcPr>
-            <w:tcW w:w="6216" w:type="dxa"/>
-            <w:tcBorders>
-              <w:top w:val="single" w:sz="4" w:space="0" w:color="D9D9D9"/>
-              <w:left w:val="single" w:sz="4" w:space="0" w:color="D9D9D9"/>
-              <w:bottom w:val="single" w:sz="4" w:space="0" w:color="D9D9D9"/>
-              <w:right w:val="single" w:sz="4" w:space="0" w:color="D9D9D9"/>
-            </w:tcBorders>
-            <w:tcMar>
-              <w:top w:w="80" w:type="dxa"/>
-              <w:left w:w="140" w:type="dxa"/>
-              <w:bottom w:w="80" w:type="dxa"/>
-              <w:right w:w="100" w:type="dxa"/>
-            </w:tcMar>
-          </w:tcPr>
-          <w:p>
-            <w:pPr>
-              <w:spacing w:line="360" w:lineRule="auto"/>
-            </w:pPr>
-            <w:r>
-              <w:t>Choose option 4, enter SV0099 or SV0005, choose a reason such as Khong mac ao CLB, and show automatic fine assignment, timestamp capture, and updated totals.</w:t>
+            <w:tcW w:type="dxa" w:w="2173"/>
+          </w:tcPr>
+          <w:p>
+            <w:r>
+              <w:t>Record a violation</w:t>
+            </w:r>
+          </w:p>
+        </w:tc>
+        <w:tc>
+          <w:tcPr>
+            <w:tcW w:type="dxa" w:w="6216"/>
+          </w:tcPr>
+          <w:p>
+            <w:r>
+              <w:t>Choose option 4, enter a member's MSSV (e.g., SE204111 for Anh). Select reason and confirm. Fine calculated automatically by role.</w:t>
             </w:r>
           </w:p>
         </w:tc>
@@ -13222,26 +13347,9 @@
       <w:tr>
         <w:tc>
           <w:tcPr>
-            <w:tcW w:w="637" w:type="dxa"/>
-            <w:tcBorders>
-              <w:top w:val="single" w:sz="4" w:space="0" w:color="D9D9D9"/>
-              <w:left w:val="single" w:sz="4" w:space="0" w:color="D9D9D9"/>
-              <w:bottom w:val="single" w:sz="4" w:space="0" w:color="D9D9D9"/>
-              <w:right w:val="single" w:sz="4" w:space="0" w:color="D9D9D9"/>
-            </w:tcBorders>
-            <w:shd w:val="clear" w:color="auto" w:fill="F2F2F2"/>
-            <w:tcMar>
-              <w:top w:w="80" w:type="dxa"/>
-              <w:left w:w="140" w:type="dxa"/>
-              <w:bottom w:w="80" w:type="dxa"/>
-              <w:right w:w="100" w:type="dxa"/>
-            </w:tcMar>
-          </w:tcPr>
-          <w:p>
-            <w:pPr>
-              <w:spacing w:line="360" w:lineRule="auto"/>
-              <w:jc w:val="center"/>
-            </w:pPr>
+            <w:tcW w:type="dxa" w:w="637"/>
+          </w:tcPr>
+          <w:p>
             <w:r>
               <w:t>7</w:t>
             </w:r>
@@ -13249,25 +13357,9 @@
         </w:tc>
         <w:tc>
           <w:tcPr>
-            <w:tcW w:w="2173" w:type="dxa"/>
-            <w:tcBorders>
-              <w:top w:val="single" w:sz="4" w:space="0" w:color="D9D9D9"/>
-              <w:left w:val="single" w:sz="4" w:space="0" w:color="D9D9D9"/>
-              <w:bottom w:val="single" w:sz="4" w:space="0" w:color="D9D9D9"/>
-              <w:right w:val="single" w:sz="4" w:space="0" w:color="D9D9D9"/>
-            </w:tcBorders>
-            <w:shd w:val="clear" w:color="auto" w:fill="F2F2F2"/>
-            <w:tcMar>
-              <w:top w:w="80" w:type="dxa"/>
-              <w:left w:w="140" w:type="dxa"/>
-              <w:bottom w:w="80" w:type="dxa"/>
-              <w:right w:w="100" w:type="dxa"/>
-            </w:tcMar>
-          </w:tcPr>
-          <w:p>
-            <w:pPr>
-              <w:spacing w:line="360" w:lineRule="auto"/>
-            </w:pPr>
+            <w:tcW w:type="dxa" w:w="2173"/>
+          </w:tcPr>
+          <w:p>
             <w:r>
               <w:t>Check Out CLB threshold</w:t>
             </w:r>
@@ -13275,26 +13367,11 @@
         </w:tc>
         <w:tc>
           <w:tcPr>
-            <w:tcW w:w="6216" w:type="dxa"/>
-            <w:tcBorders>
-              <w:top w:val="single" w:sz="4" w:space="0" w:color="D9D9D9"/>
-              <w:left w:val="single" w:sz="4" w:space="0" w:color="D9D9D9"/>
-              <w:bottom w:val="single" w:sz="4" w:space="0" w:color="D9D9D9"/>
-              <w:right w:val="single" w:sz="4" w:space="0" w:color="D9D9D9"/>
-            </w:tcBorders>
-            <w:tcMar>
-              <w:top w:w="80" w:type="dxa"/>
-              <w:left w:w="140" w:type="dxa"/>
-              <w:bottom w:w="80" w:type="dxa"/>
-              <w:right w:w="100" w:type="dxa"/>
-            </w:tcMar>
-          </w:tcPr>
-          <w:p>
-            <w:pPr>
-              <w:spacing w:line="360" w:lineRule="auto"/>
-            </w:pPr>
-            <w:r>
-              <w:t>Choose option 8. Show members near or beyond the absence threshold, especially SV0008 and SV0011 from the seeded data.</w:t>
+            <w:tcW w:type="dxa" w:w="6216"/>
+          </w:tcPr>
+          <w:p>
+            <w:r>
+              <w:t>Choose option 8. Shows members at risk; 4+ consecutive absences prompts BCN to confirm Out CLB action.</w:t>
             </w:r>
           </w:p>
         </w:tc>
@@ -13302,26 +13379,9 @@
       <w:tr>
         <w:tc>
           <w:tcPr>
-            <w:tcW w:w="637" w:type="dxa"/>
-            <w:tcBorders>
-              <w:top w:val="single" w:sz="4" w:space="0" w:color="D9D9D9"/>
-              <w:left w:val="single" w:sz="4" w:space="0" w:color="D9D9D9"/>
-              <w:bottom w:val="single" w:sz="4" w:space="0" w:color="D9D9D9"/>
-              <w:right w:val="single" w:sz="4" w:space="0" w:color="D9D9D9"/>
-            </w:tcBorders>
-            <w:shd w:val="clear" w:color="auto" w:fill="F2F2F2"/>
-            <w:tcMar>
-              <w:top w:w="80" w:type="dxa"/>
-              <w:left w:w="140" w:type="dxa"/>
-              <w:bottom w:w="80" w:type="dxa"/>
-              <w:right w:w="100" w:type="dxa"/>
-            </w:tcMar>
-          </w:tcPr>
-          <w:p>
-            <w:pPr>
-              <w:spacing w:line="360" w:lineRule="auto"/>
-              <w:jc w:val="center"/>
-            </w:pPr>
+            <w:tcW w:type="dxa" w:w="637"/>
+          </w:tcPr>
+          <w:p>
             <w:r>
               <w:t>8</w:t>
             </w:r>
@@ -13329,52 +13389,21 @@
         </w:tc>
         <w:tc>
           <w:tcPr>
-            <w:tcW w:w="2173" w:type="dxa"/>
-            <w:tcBorders>
-              <w:top w:val="single" w:sz="4" w:space="0" w:color="D9D9D9"/>
-              <w:left w:val="single" w:sz="4" w:space="0" w:color="D9D9D9"/>
-              <w:bottom w:val="single" w:sz="4" w:space="0" w:color="D9D9D9"/>
-              <w:right w:val="single" w:sz="4" w:space="0" w:color="D9D9D9"/>
-            </w:tcBorders>
-            <w:shd w:val="clear" w:color="auto" w:fill="F2F2F2"/>
-            <w:tcMar>
-              <w:top w:w="80" w:type="dxa"/>
-              <w:left w:w="140" w:type="dxa"/>
-              <w:bottom w:w="80" w:type="dxa"/>
-              <w:right w:w="100" w:type="dxa"/>
-            </w:tcMar>
-          </w:tcPr>
-          <w:p>
-            <w:pPr>
-              <w:spacing w:line="360" w:lineRule="auto"/>
-            </w:pPr>
-            <w:r>
-              <w:t>Filtered violation list</w:t>
-            </w:r>
-          </w:p>
-        </w:tc>
-        <w:tc>
-          <w:tcPr>
-            <w:tcW w:w="6216" w:type="dxa"/>
-            <w:tcBorders>
-              <w:top w:val="single" w:sz="4" w:space="0" w:color="D9D9D9"/>
-              <w:left w:val="single" w:sz="4" w:space="0" w:color="D9D9D9"/>
-              <w:bottom w:val="single" w:sz="4" w:space="0" w:color="D9D9D9"/>
-              <w:right w:val="single" w:sz="4" w:space="0" w:color="D9D9D9"/>
-            </w:tcBorders>
-            <w:tcMar>
-              <w:top w:w="80" w:type="dxa"/>
-              <w:left w:w="140" w:type="dxa"/>
-              <w:bottom w:w="80" w:type="dxa"/>
-              <w:right w:w="100" w:type="dxa"/>
-            </w:tcMar>
-          </w:tcPr>
-          <w:p>
-            <w:pPr>
-              <w:spacing w:line="360" w:lineRule="auto"/>
-            </w:pPr>
-            <w:r>
-              <w:t>Choose option 6, then filter by unpaid status. Show that unpaid records are isolated correctly.</w:t>
+            <w:tcW w:type="dxa" w:w="2173"/>
+          </w:tcPr>
+          <w:p>
+            <w:r>
+              <w:t>Kick and restore member</w:t>
+            </w:r>
+          </w:p>
+        </w:tc>
+        <w:tc>
+          <w:tcPr>
+            <w:tcW w:type="dxa" w:w="6216"/>
+          </w:tcPr>
+          <w:p>
+            <w:r>
+              <w:t>Choose option 15 to kick a member (e.g., SE210946, SE210117, SE203367). Choose option 16 to restore. Verify status change in member list.</w:t>
             </w:r>
           </w:p>
         </w:tc>
@@ -13382,31 +13411,9 @@
       <w:tr>
         <w:tc>
           <w:tcPr>
-            <w:tcW w:w="637" w:type="dxa"/>
-            <w:tcBorders>
-              <w:top w:val="single" w:sz="4" w:space="0" w:color="D9D9D9"/>
-              <w:left w:val="single" w:sz="4" w:space="0" w:color="D9D9D9"/>
-              <w:bottom w:val="single" w:sz="4" w:space="0" w:color="D9D9D9"/>
-              <w:right w:val="single" w:sz="4" w:space="0" w:color="D9D9D9"/>
-            </w:tcBorders>
-            <w:shd w:val="clear" w:color="auto" w:fill="F2F2F2"/>
-            <w:tcMar>
-              <w:top w:w="80" w:type="dxa"/>
-              <w:left w:w="140" w:type="dxa"/>
-              <w:bottom w:w="80" w:type="dxa"/>
-              <w:right w:w="100" w:type="dxa"/>
-            </w:tcMar>
-          </w:tcPr>
-          <w:p>
-            <w:pPr>
-              <w:spacing w:line="360" w:lineRule="auto"/>
-              <w:jc w:val="center"/>
-              <w:rPr>
-                <w:color w:val="595959"/>
-                <w:sz w:val="21"/>
-                <w:szCs w:val="21"/>
-              </w:rPr>
-            </w:pPr>
+            <w:tcW w:type="dxa" w:w="637"/>
+          </w:tcPr>
+          <w:p>
             <w:r>
               <w:t>9</w:t>
             </w:r>
@@ -13414,64 +13421,21 @@
         </w:tc>
         <w:tc>
           <w:tcPr>
-            <w:tcW w:w="2173" w:type="dxa"/>
-            <w:tcBorders>
-              <w:top w:val="single" w:sz="4" w:space="0" w:color="D9D9D9"/>
-              <w:left w:val="single" w:sz="4" w:space="0" w:color="D9D9D9"/>
-              <w:bottom w:val="single" w:sz="4" w:space="0" w:color="D9D9D9"/>
-              <w:right w:val="single" w:sz="4" w:space="0" w:color="D9D9D9"/>
-            </w:tcBorders>
-            <w:shd w:val="clear" w:color="auto" w:fill="F2F2F2"/>
-            <w:tcMar>
-              <w:top w:w="80" w:type="dxa"/>
-              <w:left w:w="140" w:type="dxa"/>
-              <w:bottom w:w="80" w:type="dxa"/>
-              <w:right w:w="100" w:type="dxa"/>
-            </w:tcMar>
-          </w:tcPr>
-          <w:p>
-            <w:pPr>
-              <w:spacing w:line="360" w:lineRule="auto"/>
-              <w:rPr>
-                <w:b/>
-                <w:bCs/>
-                <w:color w:val="000000"/>
-                <w:sz w:val="21"/>
-                <w:szCs w:val="21"/>
-              </w:rPr>
-            </w:pPr>
-            <w:r>
-              <w:t>Mark fine as paid</w:t>
-            </w:r>
-          </w:p>
-        </w:tc>
-        <w:tc>
-          <w:tcPr>
-            <w:tcW w:w="6216" w:type="dxa"/>
-            <w:tcBorders>
-              <w:top w:val="single" w:sz="4" w:space="0" w:color="D9D9D9"/>
-              <w:left w:val="single" w:sz="4" w:space="0" w:color="D9D9D9"/>
-              <w:bottom w:val="single" w:sz="4" w:space="0" w:color="D9D9D9"/>
-              <w:right w:val="single" w:sz="4" w:space="0" w:color="D9D9D9"/>
-            </w:tcBorders>
-            <w:tcMar>
-              <w:top w:w="80" w:type="dxa"/>
-              <w:left w:w="140" w:type="dxa"/>
-              <w:bottom w:w="80" w:type="dxa"/>
-              <w:right w:w="100" w:type="dxa"/>
-            </w:tcMar>
-          </w:tcPr>
-          <w:p>
-            <w:pPr>
-              <w:spacing w:line="360" w:lineRule="auto"/>
-              <w:rPr>
-                <w:color w:val="000000"/>
-                <w:sz w:val="21"/>
-                <w:szCs w:val="21"/>
-              </w:rPr>
-            </w:pPr>
-            <w:r>
-              <w:t>Choose option 5, enter a member with unpaid debt such as SV0002, select one unpaid record, and show the updated remaining debt.</w:t>
+            <w:tcW w:type="dxa" w:w="2173"/>
+          </w:tcPr>
+          <w:p>
+            <w:r>
+              <w:t>Filtered violation list</w:t>
+            </w:r>
+          </w:p>
+        </w:tc>
+        <w:tc>
+          <w:tcPr>
+            <w:tcW w:type="dxa" w:w="6216"/>
+          </w:tcPr>
+          <w:p>
+            <w:r>
+              <w:t>Choose option 6, then filter by team/reason/payment. Paginated results.</w:t>
             </w:r>
           </w:p>
         </w:tc>
@@ -13479,31 +13443,9 @@
       <w:tr>
         <w:tc>
           <w:tcPr>
-            <w:tcW w:w="637" w:type="dxa"/>
-            <w:tcBorders>
-              <w:top w:val="single" w:sz="4" w:space="0" w:color="D9D9D9"/>
-              <w:left w:val="single" w:sz="4" w:space="0" w:color="D9D9D9"/>
-              <w:bottom w:val="single" w:sz="4" w:space="0" w:color="D9D9D9"/>
-              <w:right w:val="single" w:sz="4" w:space="0" w:color="D9D9D9"/>
-            </w:tcBorders>
-            <w:shd w:val="clear" w:color="auto" w:fill="F2F2F2"/>
-            <w:tcMar>
-              <w:top w:w="80" w:type="dxa"/>
-              <w:left w:w="140" w:type="dxa"/>
-              <w:bottom w:w="80" w:type="dxa"/>
-              <w:right w:w="100" w:type="dxa"/>
-            </w:tcMar>
-          </w:tcPr>
-          <w:p>
-            <w:pPr>
-              <w:spacing w:line="360" w:lineRule="auto"/>
-              <w:jc w:val="center"/>
-              <w:rPr>
-                <w:color w:val="595959"/>
-                <w:sz w:val="21"/>
-                <w:szCs w:val="21"/>
-              </w:rPr>
-            </w:pPr>
+            <w:tcW w:type="dxa" w:w="637"/>
+          </w:tcPr>
+          <w:p>
             <w:r>
               <w:t>10</w:t>
             </w:r>
@@ -13511,64 +13453,21 @@
         </w:tc>
         <w:tc>
           <w:tcPr>
-            <w:tcW w:w="2173" w:type="dxa"/>
-            <w:tcBorders>
-              <w:top w:val="single" w:sz="4" w:space="0" w:color="D9D9D9"/>
-              <w:left w:val="single" w:sz="4" w:space="0" w:color="D9D9D9"/>
-              <w:bottom w:val="single" w:sz="4" w:space="0" w:color="D9D9D9"/>
-              <w:right w:val="single" w:sz="4" w:space="0" w:color="D9D9D9"/>
-            </w:tcBorders>
-            <w:shd w:val="clear" w:color="auto" w:fill="F2F2F2"/>
-            <w:tcMar>
-              <w:top w:w="80" w:type="dxa"/>
-              <w:left w:w="140" w:type="dxa"/>
-              <w:bottom w:w="80" w:type="dxa"/>
-              <w:right w:w="100" w:type="dxa"/>
-            </w:tcMar>
-          </w:tcPr>
-          <w:p>
-            <w:pPr>
-              <w:spacing w:line="360" w:lineRule="auto"/>
-              <w:rPr>
-                <w:b/>
-                <w:bCs/>
-                <w:color w:val="000000"/>
-                <w:sz w:val="21"/>
-                <w:szCs w:val="21"/>
-              </w:rPr>
-            </w:pPr>
-            <w:r>
-              <w:t>Statistics by team</w:t>
-            </w:r>
-          </w:p>
-        </w:tc>
-        <w:tc>
-          <w:tcPr>
-            <w:tcW w:w="6216" w:type="dxa"/>
-            <w:tcBorders>
-              <w:top w:val="single" w:sz="4" w:space="0" w:color="D9D9D9"/>
-              <w:left w:val="single" w:sz="4" w:space="0" w:color="D9D9D9"/>
-              <w:bottom w:val="single" w:sz="4" w:space="0" w:color="D9D9D9"/>
-              <w:right w:val="single" w:sz="4" w:space="0" w:color="D9D9D9"/>
-            </w:tcBorders>
-            <w:tcMar>
-              <w:top w:w="80" w:type="dxa"/>
-              <w:left w:w="140" w:type="dxa"/>
-              <w:bottom w:w="80" w:type="dxa"/>
-              <w:right w:w="100" w:type="dxa"/>
-            </w:tcMar>
-          </w:tcPr>
-          <w:p>
-            <w:pPr>
-              <w:spacing w:line="360" w:lineRule="auto"/>
-              <w:rPr>
-                <w:color w:val="000000"/>
-                <w:sz w:val="21"/>
-                <w:szCs w:val="21"/>
-              </w:rPr>
-            </w:pPr>
-            <w:r>
-              <w:t>Choose option 7. Show the collected, outstanding, and total fine amounts for the four teams.</w:t>
+            <w:tcW w:type="dxa" w:w="2173"/>
+          </w:tcPr>
+          <w:p>
+            <w:r>
+              <w:t>Mark fine as paid</w:t>
+            </w:r>
+          </w:p>
+        </w:tc>
+        <w:tc>
+          <w:tcPr>
+            <w:tcW w:type="dxa" w:w="6216"/>
+          </w:tcPr>
+          <w:p>
+            <w:r>
+              <w:t>Choose option 5, enter a member MSSV. View unpaid violations, mark as paid.</w:t>
             </w:r>
           </w:p>
         </w:tc>
@@ -13576,31 +13475,9 @@
       <w:tr>
         <w:tc>
           <w:tcPr>
-            <w:tcW w:w="637" w:type="dxa"/>
-            <w:tcBorders>
-              <w:top w:val="single" w:sz="4" w:space="0" w:color="D9D9D9"/>
-              <w:left w:val="single" w:sz="4" w:space="0" w:color="D9D9D9"/>
-              <w:bottom w:val="single" w:sz="4" w:space="0" w:color="D9D9D9"/>
-              <w:right w:val="single" w:sz="4" w:space="0" w:color="D9D9D9"/>
-            </w:tcBorders>
-            <w:shd w:val="clear" w:color="auto" w:fill="F2F2F2"/>
-            <w:tcMar>
-              <w:top w:w="80" w:type="dxa"/>
-              <w:left w:w="140" w:type="dxa"/>
-              <w:bottom w:w="80" w:type="dxa"/>
-              <w:right w:w="100" w:type="dxa"/>
-            </w:tcMar>
-          </w:tcPr>
-          <w:p>
-            <w:pPr>
-              <w:spacing w:line="360" w:lineRule="auto"/>
-              <w:jc w:val="center"/>
-              <w:rPr>
-                <w:color w:val="595959"/>
-                <w:sz w:val="21"/>
-                <w:szCs w:val="21"/>
-              </w:rPr>
-            </w:pPr>
+            <w:tcW w:type="dxa" w:w="637"/>
+          </w:tcPr>
+          <w:p>
             <w:r>
               <w:t>11</w:t>
             </w:r>
@@ -13608,64 +13485,21 @@
         </w:tc>
         <w:tc>
           <w:tcPr>
-            <w:tcW w:w="2173" w:type="dxa"/>
-            <w:tcBorders>
-              <w:top w:val="single" w:sz="4" w:space="0" w:color="D9D9D9"/>
-              <w:left w:val="single" w:sz="4" w:space="0" w:color="D9D9D9"/>
-              <w:bottom w:val="single" w:sz="4" w:space="0" w:color="D9D9D9"/>
-              <w:right w:val="single" w:sz="4" w:space="0" w:color="D9D9D9"/>
-            </w:tcBorders>
-            <w:shd w:val="clear" w:color="auto" w:fill="F2F2F2"/>
-            <w:tcMar>
-              <w:top w:w="80" w:type="dxa"/>
-              <w:left w:w="140" w:type="dxa"/>
-              <w:bottom w:w="80" w:type="dxa"/>
-              <w:right w:w="100" w:type="dxa"/>
-            </w:tcMar>
-          </w:tcPr>
-          <w:p>
-            <w:pPr>
-              <w:spacing w:line="360" w:lineRule="auto"/>
-              <w:rPr>
-                <w:b/>
-                <w:bCs/>
-                <w:color w:val="000000"/>
-                <w:sz w:val="21"/>
-                <w:szCs w:val="21"/>
-              </w:rPr>
-            </w:pPr>
-            <w:r>
-              <w:t>Sort by violation count</w:t>
-            </w:r>
-          </w:p>
-        </w:tc>
-        <w:tc>
-          <w:tcPr>
-            <w:tcW w:w="6216" w:type="dxa"/>
-            <w:tcBorders>
-              <w:top w:val="single" w:sz="4" w:space="0" w:color="D9D9D9"/>
-              <w:left w:val="single" w:sz="4" w:space="0" w:color="D9D9D9"/>
-              <w:bottom w:val="single" w:sz="4" w:space="0" w:color="D9D9D9"/>
-              <w:right w:val="single" w:sz="4" w:space="0" w:color="D9D9D9"/>
-            </w:tcBorders>
-            <w:tcMar>
-              <w:top w:w="80" w:type="dxa"/>
-              <w:left w:w="140" w:type="dxa"/>
-              <w:bottom w:w="80" w:type="dxa"/>
-              <w:right w:w="100" w:type="dxa"/>
-            </w:tcMar>
-          </w:tcPr>
-          <w:p>
-            <w:pPr>
-              <w:spacing w:line="360" w:lineRule="auto"/>
-              <w:rPr>
-                <w:color w:val="000000"/>
-                <w:sz w:val="21"/>
-                <w:szCs w:val="21"/>
-              </w:rPr>
-            </w:pPr>
-            <w:r>
-              <w:t>Choose option 9, then descending. Show the ranking of members with the highest number of violations first.</w:t>
+            <w:tcW w:type="dxa" w:w="2173"/>
+          </w:tcPr>
+          <w:p>
+            <w:r>
+              <w:t>Statistics by team</w:t>
+            </w:r>
+          </w:p>
+        </w:tc>
+        <w:tc>
+          <w:tcPr>
+            <w:tcW w:type="dxa" w:w="6216"/>
+          </w:tcPr>
+          <w:p>
+            <w:r>
+              <w:t>Choose option 7. Shows collected, outstanding, and total fines per team.</w:t>
             </w:r>
           </w:p>
         </w:tc>
@@ -13673,97 +13507,31 @@
       <w:tr>
         <w:tc>
           <w:tcPr>
-            <w:tcW w:w="637" w:type="dxa"/>
-            <w:tcBorders>
-              <w:top w:val="single" w:sz="4" w:space="0" w:color="D9D9D9"/>
-              <w:left w:val="single" w:sz="4" w:space="0" w:color="D9D9D9"/>
-              <w:bottom w:val="single" w:sz="4" w:space="0" w:color="D9D9D9"/>
-              <w:right w:val="single" w:sz="4" w:space="0" w:color="D9D9D9"/>
-            </w:tcBorders>
-            <w:shd w:val="clear" w:color="auto" w:fill="F2F2F2"/>
-            <w:tcMar>
-              <w:top w:w="80" w:type="dxa"/>
-              <w:left w:w="140" w:type="dxa"/>
-              <w:bottom w:w="80" w:type="dxa"/>
-              <w:right w:w="100" w:type="dxa"/>
-            </w:tcMar>
-          </w:tcPr>
-          <w:p>
-            <w:pPr>
-              <w:spacing w:line="360" w:lineRule="auto"/>
-              <w:jc w:val="center"/>
-              <w:rPr>
-                <w:color w:val="595959"/>
-                <w:sz w:val="21"/>
-                <w:szCs w:val="21"/>
-              </w:rPr>
-            </w:pPr>
-            <w:r>
-              <w:lastRenderedPageBreak/>
+            <w:tcW w:type="dxa" w:w="637"/>
+          </w:tcPr>
+          <w:p>
+            <w:r>
               <w:t>12</w:t>
             </w:r>
           </w:p>
         </w:tc>
         <w:tc>
           <w:tcPr>
-            <w:tcW w:w="2173" w:type="dxa"/>
-            <w:tcBorders>
-              <w:top w:val="single" w:sz="4" w:space="0" w:color="D9D9D9"/>
-              <w:left w:val="single" w:sz="4" w:space="0" w:color="D9D9D9"/>
-              <w:bottom w:val="single" w:sz="4" w:space="0" w:color="D9D9D9"/>
-              <w:right w:val="single" w:sz="4" w:space="0" w:color="D9D9D9"/>
-            </w:tcBorders>
-            <w:shd w:val="clear" w:color="auto" w:fill="F2F2F2"/>
-            <w:tcMar>
-              <w:top w:w="80" w:type="dxa"/>
-              <w:left w:w="140" w:type="dxa"/>
-              <w:bottom w:w="80" w:type="dxa"/>
-              <w:right w:w="100" w:type="dxa"/>
-            </w:tcMar>
-          </w:tcPr>
-          <w:p>
-            <w:pPr>
-              <w:spacing w:line="360" w:lineRule="auto"/>
-              <w:rPr>
-                <w:b/>
-                <w:bCs/>
-                <w:color w:val="000000"/>
-                <w:sz w:val="21"/>
-                <w:szCs w:val="21"/>
-              </w:rPr>
-            </w:pPr>
-            <w:r>
-              <w:t>Export report</w:t>
-            </w:r>
-          </w:p>
-        </w:tc>
-        <w:tc>
-          <w:tcPr>
-            <w:tcW w:w="6216" w:type="dxa"/>
-            <w:tcBorders>
-              <w:top w:val="single" w:sz="4" w:space="0" w:color="D9D9D9"/>
-              <w:left w:val="single" w:sz="4" w:space="0" w:color="D9D9D9"/>
-              <w:bottom w:val="single" w:sz="4" w:space="0" w:color="D9D9D9"/>
-              <w:right w:val="single" w:sz="4" w:space="0" w:color="D9D9D9"/>
-            </w:tcBorders>
-            <w:tcMar>
-              <w:top w:w="80" w:type="dxa"/>
-              <w:left w:w="140" w:type="dxa"/>
-              <w:bottom w:w="80" w:type="dxa"/>
-              <w:right w:w="100" w:type="dxa"/>
-            </w:tcMar>
-          </w:tcPr>
-          <w:p>
-            <w:pPr>
-              <w:spacing w:line="360" w:lineRule="auto"/>
-              <w:rPr>
-                <w:color w:val="000000"/>
-                <w:sz w:val="21"/>
-                <w:szCs w:val="21"/>
-              </w:rPr>
-            </w:pPr>
-            <w:r>
-              <w:t>Choose option 10. Show the generated file path violation_report_YYYYMMDD_HHMMSS.txt near the executable and open the file if needed.</w:t>
+            <w:tcW w:type="dxa" w:w="2173"/>
+          </w:tcPr>
+          <w:p>
+            <w:r>
+              <w:t>Sort by violation count</w:t>
+            </w:r>
+          </w:p>
+        </w:tc>
+        <w:tc>
+          <w:tcPr>
+            <w:tcW w:type="dxa" w:w="6216"/>
+          </w:tcPr>
+          <w:p>
+            <w:r>
+              <w:t>Choose option 9, then descending order. Members sorted by violation count.</w:t>
             </w:r>
           </w:p>
         </w:tc>
@@ -13771,31 +13539,9 @@
       <w:tr>
         <w:tc>
           <w:tcPr>
-            <w:tcW w:w="637" w:type="dxa"/>
-            <w:tcBorders>
-              <w:top w:val="single" w:sz="4" w:space="0" w:color="D9D9D9"/>
-              <w:left w:val="single" w:sz="4" w:space="0" w:color="D9D9D9"/>
-              <w:bottom w:val="single" w:sz="4" w:space="0" w:color="D9D9D9"/>
-              <w:right w:val="single" w:sz="4" w:space="0" w:color="D9D9D9"/>
-            </w:tcBorders>
-            <w:shd w:val="clear" w:color="auto" w:fill="F2F2F2"/>
-            <w:tcMar>
-              <w:top w:w="80" w:type="dxa"/>
-              <w:left w:w="140" w:type="dxa"/>
-              <w:bottom w:w="80" w:type="dxa"/>
-              <w:right w:w="100" w:type="dxa"/>
-            </w:tcMar>
-          </w:tcPr>
-          <w:p>
-            <w:pPr>
-              <w:spacing w:line="360" w:lineRule="auto"/>
-              <w:jc w:val="center"/>
-              <w:rPr>
-                <w:color w:val="595959"/>
-                <w:sz w:val="21"/>
-                <w:szCs w:val="21"/>
-              </w:rPr>
-            </w:pPr>
+            <w:tcW w:type="dxa" w:w="637"/>
+          </w:tcPr>
+          <w:p>
             <w:r>
               <w:t>13</w:t>
             </w:r>
@@ -13803,64 +13549,21 @@
         </w:tc>
         <w:tc>
           <w:tcPr>
-            <w:tcW w:w="2173" w:type="dxa"/>
-            <w:tcBorders>
-              <w:top w:val="single" w:sz="4" w:space="0" w:color="D9D9D9"/>
-              <w:left w:val="single" w:sz="4" w:space="0" w:color="D9D9D9"/>
-              <w:bottom w:val="single" w:sz="4" w:space="0" w:color="D9D9D9"/>
-              <w:right w:val="single" w:sz="4" w:space="0" w:color="D9D9D9"/>
-            </w:tcBorders>
-            <w:shd w:val="clear" w:color="auto" w:fill="F2F2F2"/>
-            <w:tcMar>
-              <w:top w:w="80" w:type="dxa"/>
-              <w:left w:w="140" w:type="dxa"/>
-              <w:bottom w:w="80" w:type="dxa"/>
-              <w:right w:w="100" w:type="dxa"/>
-            </w:tcMar>
-          </w:tcPr>
-          <w:p>
-            <w:pPr>
-              <w:spacing w:line="360" w:lineRule="auto"/>
-              <w:rPr>
-                <w:b/>
-                <w:bCs/>
-                <w:color w:val="000000"/>
-                <w:sz w:val="21"/>
-                <w:szCs w:val="21"/>
-              </w:rPr>
-            </w:pPr>
-            <w:r>
-              <w:t>Search by date range</w:t>
-            </w:r>
-          </w:p>
-        </w:tc>
-        <w:tc>
-          <w:tcPr>
-            <w:tcW w:w="6216" w:type="dxa"/>
-            <w:tcBorders>
-              <w:top w:val="single" w:sz="4" w:space="0" w:color="D9D9D9"/>
-              <w:left w:val="single" w:sz="4" w:space="0" w:color="D9D9D9"/>
-              <w:bottom w:val="single" w:sz="4" w:space="0" w:color="D9D9D9"/>
-              <w:right w:val="single" w:sz="4" w:space="0" w:color="D9D9D9"/>
-            </w:tcBorders>
-            <w:tcMar>
-              <w:top w:w="80" w:type="dxa"/>
-              <w:left w:w="140" w:type="dxa"/>
-              <w:bottom w:w="80" w:type="dxa"/>
-              <w:right w:w="100" w:type="dxa"/>
-            </w:tcMar>
-          </w:tcPr>
-          <w:p>
-            <w:pPr>
-              <w:spacing w:line="360" w:lineRule="auto"/>
-              <w:rPr>
-                <w:color w:val="000000"/>
-                <w:sz w:val="21"/>
-                <w:szCs w:val="21"/>
-              </w:rPr>
-            </w:pPr>
-            <w:r>
-              <w:t>Choose option 11, enter a valid date interval such as 01/03/2026 to 30/04/2026, and show the filtered rows.</w:t>
+            <w:tcW w:type="dxa" w:w="2173"/>
+          </w:tcPr>
+          <w:p>
+            <w:r>
+              <w:t>Export report</w:t>
+            </w:r>
+          </w:p>
+        </w:tc>
+        <w:tc>
+          <w:tcPr>
+            <w:tcW w:type="dxa" w:w="6216"/>
+          </w:tcPr>
+          <w:p>
+            <w:r>
+              <w:t>Choose option 10. Generates a .txt report beside the executable.</w:t>
             </w:r>
           </w:p>
         </w:tc>
@@ -13868,31 +13571,9 @@
       <w:tr>
         <w:tc>
           <w:tcPr>
-            <w:tcW w:w="637" w:type="dxa"/>
-            <w:tcBorders>
-              <w:top w:val="single" w:sz="4" w:space="0" w:color="D9D9D9"/>
-              <w:left w:val="single" w:sz="4" w:space="0" w:color="D9D9D9"/>
-              <w:bottom w:val="single" w:sz="4" w:space="0" w:color="D9D9D9"/>
-              <w:right w:val="single" w:sz="4" w:space="0" w:color="D9D9D9"/>
-            </w:tcBorders>
-            <w:shd w:val="clear" w:color="auto" w:fill="F2F2F2"/>
-            <w:tcMar>
-              <w:top w:w="80" w:type="dxa"/>
-              <w:left w:w="140" w:type="dxa"/>
-              <w:bottom w:w="80" w:type="dxa"/>
-              <w:right w:w="100" w:type="dxa"/>
-            </w:tcMar>
-          </w:tcPr>
-          <w:p>
-            <w:pPr>
-              <w:spacing w:line="360" w:lineRule="auto"/>
-              <w:jc w:val="center"/>
-              <w:rPr>
-                <w:color w:val="595959"/>
-                <w:sz w:val="21"/>
-                <w:szCs w:val="21"/>
-              </w:rPr>
-            </w:pPr>
+            <w:tcW w:type="dxa" w:w="637"/>
+          </w:tcPr>
+          <w:p>
             <w:r>
               <w:t>14</w:t>
             </w:r>
@@ -13900,64 +13581,21 @@
         </w:tc>
         <w:tc>
           <w:tcPr>
-            <w:tcW w:w="2173" w:type="dxa"/>
-            <w:tcBorders>
-              <w:top w:val="single" w:sz="4" w:space="0" w:color="D9D9D9"/>
-              <w:left w:val="single" w:sz="4" w:space="0" w:color="D9D9D9"/>
-              <w:bottom w:val="single" w:sz="4" w:space="0" w:color="D9D9D9"/>
-              <w:right w:val="single" w:sz="4" w:space="0" w:color="D9D9D9"/>
-            </w:tcBorders>
-            <w:shd w:val="clear" w:color="auto" w:fill="F2F2F2"/>
-            <w:tcMar>
-              <w:top w:w="80" w:type="dxa"/>
-              <w:left w:w="140" w:type="dxa"/>
-              <w:bottom w:w="80" w:type="dxa"/>
-              <w:right w:w="100" w:type="dxa"/>
-            </w:tcMar>
-          </w:tcPr>
-          <w:p>
-            <w:pPr>
-              <w:spacing w:line="360" w:lineRule="auto"/>
-              <w:rPr>
-                <w:b/>
-                <w:bCs/>
-                <w:color w:val="000000"/>
-                <w:sz w:val="21"/>
-                <w:szCs w:val="21"/>
-              </w:rPr>
-            </w:pPr>
-            <w:r>
-              <w:t>Member self-service flow</w:t>
-            </w:r>
-          </w:p>
-        </w:tc>
-        <w:tc>
-          <w:tcPr>
-            <w:tcW w:w="6216" w:type="dxa"/>
-            <w:tcBorders>
-              <w:top w:val="single" w:sz="4" w:space="0" w:color="D9D9D9"/>
-              <w:left w:val="single" w:sz="4" w:space="0" w:color="D9D9D9"/>
-              <w:bottom w:val="single" w:sz="4" w:space="0" w:color="D9D9D9"/>
-              <w:right w:val="single" w:sz="4" w:space="0" w:color="D9D9D9"/>
-            </w:tcBorders>
-            <w:tcMar>
-              <w:top w:w="80" w:type="dxa"/>
-              <w:left w:w="140" w:type="dxa"/>
-              <w:bottom w:w="80" w:type="dxa"/>
-              <w:right w:w="100" w:type="dxa"/>
-            </w:tcMar>
-          </w:tcPr>
-          <w:p>
-            <w:pPr>
-              <w:spacing w:line="360" w:lineRule="auto"/>
-              <w:rPr>
-                <w:color w:val="000000"/>
-                <w:sz w:val="21"/>
-                <w:szCs w:val="21"/>
-              </w:rPr>
-            </w:pPr>
-            <w:r>
-              <w:t>Logout and login as a member account such as SV0002 / 123456, then show profile, own violations, and own outstanding fines.</w:t>
+            <w:tcW w:type="dxa" w:w="2173"/>
+          </w:tcPr>
+          <w:p>
+            <w:r>
+              <w:t>Search by date range</w:t>
+            </w:r>
+          </w:p>
+        </w:tc>
+        <w:tc>
+          <w:tcPr>
+            <w:tcW w:type="dxa" w:w="6216"/>
+          </w:tcPr>
+          <w:p>
+            <w:r>
+              <w:t>Choose option 11. Enter valid date range; paginated results. Invalid dates re-prompt until corrected.</w:t>
             </w:r>
           </w:p>
         </w:tc>
@@ -13965,31 +13603,9 @@
       <w:tr>
         <w:tc>
           <w:tcPr>
-            <w:tcW w:w="637" w:type="dxa"/>
-            <w:tcBorders>
-              <w:top w:val="single" w:sz="4" w:space="0" w:color="D9D9D9"/>
-              <w:left w:val="single" w:sz="4" w:space="0" w:color="D9D9D9"/>
-              <w:bottom w:val="single" w:sz="4" w:space="0" w:color="D9D9D9"/>
-              <w:right w:val="single" w:sz="4" w:space="0" w:color="D9D9D9"/>
-            </w:tcBorders>
-            <w:shd w:val="clear" w:color="auto" w:fill="F2F2F2"/>
-            <w:tcMar>
-              <w:top w:w="80" w:type="dxa"/>
-              <w:left w:w="140" w:type="dxa"/>
-              <w:bottom w:w="80" w:type="dxa"/>
-              <w:right w:w="100" w:type="dxa"/>
-            </w:tcMar>
-          </w:tcPr>
-          <w:p>
-            <w:pPr>
-              <w:spacing w:line="360" w:lineRule="auto"/>
-              <w:jc w:val="center"/>
-              <w:rPr>
-                <w:color w:val="595959"/>
-                <w:sz w:val="21"/>
-                <w:szCs w:val="21"/>
-              </w:rPr>
-            </w:pPr>
+            <w:tcW w:type="dxa" w:w="637"/>
+          </w:tcPr>
+          <w:p>
             <w:r>
               <w:t>15</w:t>
             </w:r>
@@ -13997,32 +13613,73 @@
         </w:tc>
         <w:tc>
           <w:tcPr>
-            <w:tcW w:w="2173" w:type="dxa"/>
-            <w:tcBorders>
-              <w:top w:val="single" w:sz="4" w:space="0" w:color="D9D9D9"/>
-              <w:left w:val="single" w:sz="4" w:space="0" w:color="D9D9D9"/>
-              <w:bottom w:val="single" w:sz="4" w:space="0" w:color="D9D9D9"/>
-              <w:right w:val="single" w:sz="4" w:space="0" w:color="D9D9D9"/>
-            </w:tcBorders>
-            <w:shd w:val="clear" w:color="auto" w:fill="F2F2F2"/>
-            <w:tcMar>
-              <w:top w:w="80" w:type="dxa"/>
-              <w:left w:w="140" w:type="dxa"/>
-              <w:bottom w:w="80" w:type="dxa"/>
-              <w:right w:w="100" w:type="dxa"/>
-            </w:tcMar>
-          </w:tcPr>
-          <w:p>
-            <w:pPr>
-              <w:spacing w:line="360" w:lineRule="auto"/>
-              <w:rPr>
-                <w:b/>
-                <w:bCs/>
-                <w:color w:val="000000"/>
-                <w:sz w:val="21"/>
-                <w:szCs w:val="21"/>
-              </w:rPr>
-            </w:pPr>
+            <w:tcW w:type="dxa" w:w="2173"/>
+          </w:tcPr>
+          <w:p>
+            <w:r>
+              <w:t>Member self-service</w:t>
+            </w:r>
+          </w:p>
+        </w:tc>
+        <w:tc>
+          <w:tcPr>
+            <w:tcW w:type="dxa" w:w="6216"/>
+          </w:tcPr>
+          <w:p>
+            <w:r>
+              <w:t>Logout and login as a member (any student MSSV as password, e.g., SE204111/SE204111). Member menu shows profile, own violations, own fines.</w:t>
+            </w:r>
+          </w:p>
+        </w:tc>
+      </w:tr>
+      <w:tr>
+        <w:tc>
+          <w:tcPr>
+            <w:tcW w:type="dxa" w:w="637"/>
+          </w:tcPr>
+          <w:p>
+            <w:r>
+              <w:t>16</w:t>
+            </w:r>
+          </w:p>
+        </w:tc>
+        <w:tc>
+          <w:tcPr>
+            <w:tcW w:type="dxa" w:w="2173"/>
+          </w:tcPr>
+          <w:p>
+            <w:r>
+              <w:t>Discipline Dashboard</w:t>
+            </w:r>
+          </w:p>
+        </w:tc>
+        <w:tc>
+          <w:tcPr>
+            <w:tcW w:type="dxa" w:w="6216"/>
+          </w:tcPr>
+          <w:p>
+            <w:r>
+              <w:t>BCN option 14. Shows kicked members, near-threshold warnings, recent violations.</w:t>
+            </w:r>
+          </w:p>
+        </w:tc>
+      </w:tr>
+      <w:tr>
+        <w:tc>
+          <w:tcPr>
+            <w:tcW w:type="dxa" w:w="637"/>
+          </w:tcPr>
+          <w:p>
+            <w:r>
+              <w:t>17</w:t>
+            </w:r>
+          </w:p>
+        </w:tc>
+        <w:tc>
+          <w:tcPr>
+            <w:tcW w:type="dxa" w:w="2173"/>
+          </w:tcPr>
+          <w:p>
             <w:r>
               <w:t>Persistence check</w:t>
             </w:r>
@@ -14030,31 +13687,11 @@
         </w:tc>
         <w:tc>
           <w:tcPr>
-            <w:tcW w:w="6216" w:type="dxa"/>
-            <w:tcBorders>
-              <w:top w:val="single" w:sz="4" w:space="0" w:color="D9D9D9"/>
-              <w:left w:val="single" w:sz="4" w:space="0" w:color="D9D9D9"/>
-              <w:bottom w:val="single" w:sz="4" w:space="0" w:color="D9D9D9"/>
-              <w:right w:val="single" w:sz="4" w:space="0" w:color="D9D9D9"/>
-            </w:tcBorders>
-            <w:tcMar>
-              <w:top w:w="80" w:type="dxa"/>
-              <w:left w:w="140" w:type="dxa"/>
-              <w:bottom w:w="80" w:type="dxa"/>
-              <w:right w:w="100" w:type="dxa"/>
-            </w:tcMar>
-          </w:tcPr>
-          <w:p>
-            <w:pPr>
-              <w:spacing w:line="360" w:lineRule="auto"/>
-              <w:rPr>
-                <w:color w:val="000000"/>
-                <w:sz w:val="21"/>
-                <w:szCs w:val="21"/>
-              </w:rPr>
-            </w:pPr>
-            <w:r>
-              <w:t>Exit the program and reopen it. Confirm that previously saved changes remain because data is persisted in .dat files.</w:t>
+            <w:tcW w:type="dxa" w:w="6216"/>
+          </w:tcPr>
+          <w:p>
+            <w:r>
+              <w:t>Exit and reopen. All data persists: members, violations, payment status, kicks.</w:t>
             </w:r>
           </w:p>
         </w:tc>
@@ -14282,77 +13919,29 @@
       <w:tr>
         <w:tc>
           <w:tcPr>
-            <w:tcW w:w="2351" w:type="dxa"/>
-            <w:tcBorders>
-              <w:top w:val="single" w:sz="4" w:space="0" w:color="D9D9D9"/>
-              <w:left w:val="single" w:sz="4" w:space="0" w:color="D9D9D9"/>
-              <w:bottom w:val="single" w:sz="4" w:space="0" w:color="D9D9D9"/>
-              <w:right w:val="single" w:sz="4" w:space="0" w:color="D9D9D9"/>
-            </w:tcBorders>
-            <w:shd w:val="clear" w:color="auto" w:fill="F2F2F2"/>
-            <w:tcMar>
-              <w:top w:w="80" w:type="dxa"/>
-              <w:left w:w="140" w:type="dxa"/>
-              <w:bottom w:w="80" w:type="dxa"/>
-              <w:right w:w="100" w:type="dxa"/>
-            </w:tcMar>
-          </w:tcPr>
-          <w:p>
-            <w:pPr>
-              <w:spacing w:line="360" w:lineRule="auto"/>
-            </w:pPr>
-            <w:r>
-              <w:t>Invalid calendar dates may be normalized instead of rejected</w:t>
-            </w:r>
-          </w:p>
-        </w:tc>
-        <w:tc>
-          <w:tcPr>
-            <w:tcW w:w="2945" w:type="dxa"/>
-            <w:tcBorders>
-              <w:top w:val="single" w:sz="4" w:space="0" w:color="D9D9D9"/>
-              <w:left w:val="single" w:sz="4" w:space="0" w:color="D9D9D9"/>
-              <w:bottom w:val="single" w:sz="4" w:space="0" w:color="D9D9D9"/>
-              <w:right w:val="single" w:sz="4" w:space="0" w:color="D9D9D9"/>
-            </w:tcBorders>
-            <w:tcMar>
-              <w:top w:w="80" w:type="dxa"/>
-              <w:left w:w="140" w:type="dxa"/>
-              <w:bottom w:w="80" w:type="dxa"/>
-              <w:right w:w="100" w:type="dxa"/>
-            </w:tcMar>
-          </w:tcPr>
-          <w:p>
-            <w:pPr>
-              <w:spacing w:line="360" w:lineRule="auto"/>
-            </w:pPr>
-            <w:r>
-              <w:t>parseDate() uses mktime() after parsing dd/mm/yyyy. Inputs like 31/02/2026 can be normalized by the C runtime into a different valid date instead of being rejected explicitly.</w:t>
-            </w:r>
-          </w:p>
-        </w:tc>
-        <w:tc>
-          <w:tcPr>
-            <w:tcW w:w="975" w:type="dxa"/>
-            <w:tcBorders>
-              <w:top w:val="single" w:sz="4" w:space="0" w:color="D9D9D9"/>
-              <w:left w:val="single" w:sz="4" w:space="0" w:color="D9D9D9"/>
-              <w:bottom w:val="single" w:sz="4" w:space="0" w:color="D9D9D9"/>
-              <w:right w:val="single" w:sz="4" w:space="0" w:color="D9D9D9"/>
-            </w:tcBorders>
-            <w:shd w:val="clear" w:color="auto" w:fill="F2DBDB" w:themeFill="accent2" w:themeFillTint="33"/>
-            <w:tcMar>
-              <w:top w:w="80" w:type="dxa"/>
-              <w:left w:w="140" w:type="dxa"/>
-              <w:bottom w:w="80" w:type="dxa"/>
-              <w:right w:w="100" w:type="dxa"/>
-            </w:tcMar>
-          </w:tcPr>
-          <w:p>
-            <w:pPr>
-              <w:spacing w:line="360" w:lineRule="auto"/>
-              <w:jc w:val="center"/>
-            </w:pPr>
+            <w:tcW w:type="dxa" w:w="2351"/>
+          </w:tcPr>
+          <w:p>
+            <w:r>
+              <w:t>Invalid calendar dates may be accepted</w:t>
+            </w:r>
+          </w:p>
+        </w:tc>
+        <w:tc>
+          <w:tcPr>
+            <w:tcW w:type="dxa" w:w="2945"/>
+          </w:tcPr>
+          <w:p>
+            <w:r>
+              <w:t>parseDate() uses mktime() after sscanf(), which silently normalizes invalid dates (e.g., 31/02/2026 becomes 03/03/2026). Users may not realize the date was adjusted.</w:t>
+            </w:r>
+          </w:p>
+        </w:tc>
+        <w:tc>
+          <w:tcPr>
+            <w:tcW w:type="dxa" w:w="975"/>
+          </w:tcPr>
+          <w:p>
             <w:r>
               <w:t>High</w:t>
             </w:r>
@@ -14360,26 +13949,11 @@
         </w:tc>
         <w:tc>
           <w:tcPr>
-            <w:tcW w:w="2755" w:type="dxa"/>
-            <w:tcBorders>
-              <w:top w:val="single" w:sz="4" w:space="0" w:color="D9D9D9"/>
-              <w:left w:val="single" w:sz="4" w:space="0" w:color="D9D9D9"/>
-              <w:bottom w:val="single" w:sz="4" w:space="0" w:color="D9D9D9"/>
-              <w:right w:val="single" w:sz="4" w:space="0" w:color="D9D9D9"/>
-            </w:tcBorders>
-            <w:tcMar>
-              <w:top w:w="80" w:type="dxa"/>
-              <w:left w:w="140" w:type="dxa"/>
-              <w:bottom w:w="80" w:type="dxa"/>
-              <w:right w:w="100" w:type="dxa"/>
-            </w:tcMar>
-          </w:tcPr>
-          <w:p>
-            <w:pPr>
-              <w:spacing w:line="360" w:lineRule="auto"/>
-            </w:pPr>
-            <w:r>
-              <w:t>Validate day/month/year combinations before calling mktime(), or verify that the normalized struct tm still matches the original input.</w:t>
+            <w:tcW w:type="dxa" w:w="2755"/>
+          </w:tcPr>
+          <w:p>
+            <w:r>
+              <w:t>Validate day/month/year combinations before calling mktime().</w:t>
             </w:r>
           </w:p>
         </w:tc>
@@ -14387,77 +13961,29 @@
       <w:tr>
         <w:tc>
           <w:tcPr>
-            <w:tcW w:w="2351" w:type="dxa"/>
-            <w:tcBorders>
-              <w:top w:val="single" w:sz="4" w:space="0" w:color="D9D9D9"/>
-              <w:left w:val="single" w:sz="4" w:space="0" w:color="D9D9D9"/>
-              <w:bottom w:val="single" w:sz="4" w:space="0" w:color="D9D9D9"/>
-              <w:right w:val="single" w:sz="4" w:space="0" w:color="D9D9D9"/>
-            </w:tcBorders>
-            <w:shd w:val="clear" w:color="auto" w:fill="F2F2F2"/>
-            <w:tcMar>
-              <w:top w:w="80" w:type="dxa"/>
-              <w:left w:w="140" w:type="dxa"/>
-              <w:bottom w:w="80" w:type="dxa"/>
-              <w:right w:w="100" w:type="dxa"/>
-            </w:tcMar>
-          </w:tcPr>
-          <w:p>
-            <w:pPr>
-              <w:spacing w:line="360" w:lineRule="auto"/>
-            </w:pPr>
-            <w:r>
-              <w:t>Violation record lookup by name partially implemented</w:t>
-            </w:r>
-          </w:p>
-        </w:tc>
-        <w:tc>
-          <w:tcPr>
-            <w:tcW w:w="2945" w:type="dxa"/>
-            <w:tcBorders>
-              <w:top w:val="single" w:sz="4" w:space="0" w:color="D9D9D9"/>
-              <w:left w:val="single" w:sz="4" w:space="0" w:color="D9D9D9"/>
-              <w:bottom w:val="single" w:sz="4" w:space="0" w:color="D9D9D9"/>
-              <w:right w:val="single" w:sz="4" w:space="0" w:color="D9D9D9"/>
-            </w:tcBorders>
-            <w:tcMar>
-              <w:top w:w="80" w:type="dxa"/>
-              <w:left w:w="140" w:type="dxa"/>
-              <w:bottom w:w="80" w:type="dxa"/>
-              <w:right w:w="100" w:type="dxa"/>
-            </w:tcMar>
-          </w:tcPr>
-          <w:p>
-            <w:pPr>
-              <w:spacing w:line="360" w:lineRule="auto"/>
-            </w:pPr>
-            <w:r>
-              <w:t>violationRecord() now supports both MSSV exact match and case-insensitive name substring search via memberSearchByName(). When multiple members match the name keyword, a numbered selection list is displayed. However, the search is limited to exact substring matching and does not support fuzzy or diacritic-aware matching for Vietnamese names.</w:t>
-            </w:r>
-          </w:p>
-        </w:tc>
-        <w:tc>
-          <w:tcPr>
-            <w:tcW w:w="975" w:type="dxa"/>
-            <w:tcBorders>
-              <w:top w:val="single" w:sz="4" w:space="0" w:color="D9D9D9"/>
-              <w:left w:val="single" w:sz="4" w:space="0" w:color="D9D9D9"/>
-              <w:bottom w:val="single" w:sz="4" w:space="0" w:color="D9D9D9"/>
-              <w:right w:val="single" w:sz="4" w:space="0" w:color="D9D9D9"/>
-            </w:tcBorders>
-            <w:shd w:val="clear" w:color="auto" w:fill="F2F2F2" w:themeFill="background1" w:themeFillShade="F2"/>
-            <w:tcMar>
-              <w:top w:w="80" w:type="dxa"/>
-              <w:left w:w="140" w:type="dxa"/>
-              <w:bottom w:w="80" w:type="dxa"/>
-              <w:right w:w="100" w:type="dxa"/>
-            </w:tcMar>
-          </w:tcPr>
-          <w:p>
-            <w:pPr>
-              <w:spacing w:line="360" w:lineRule="auto"/>
-              <w:jc w:val="center"/>
-            </w:pPr>
+            <w:tcW w:type="dxa" w:w="2351"/>
+          </w:tcPr>
+          <w:p>
+            <w:r>
+              <w:t>Violation record lookup by name localized</w:t>
+            </w:r>
+          </w:p>
+        </w:tc>
+        <w:tc>
+          <w:tcPr>
+            <w:tcW w:type="dxa" w:w="2945"/>
+          </w:tcPr>
+          <w:p>
+            <w:r>
+              <w:t>violationRecord() supports lookup by name, but diacritic characters in Vietnamese names may cause mismatches.</w:t>
+            </w:r>
+          </w:p>
+        </w:tc>
+        <w:tc>
+          <w:tcPr>
+            <w:tcW w:type="dxa" w:w="975"/>
+          </w:tcPr>
+          <w:p>
             <w:r>
               <w:t>Low</w:t>
             </w:r>
@@ -14465,26 +13991,95 @@
         </w:tc>
         <w:tc>
           <w:tcPr>
-            <w:tcW w:w="2755" w:type="dxa"/>
-            <w:tcBorders>
-              <w:top w:val="single" w:sz="4" w:space="0" w:color="D9D9D9"/>
-              <w:left w:val="single" w:sz="4" w:space="0" w:color="D9D9D9"/>
-              <w:bottom w:val="single" w:sz="4" w:space="0" w:color="D9D9D9"/>
-              <w:right w:val="single" w:sz="4" w:space="0" w:color="D9D9D9"/>
-            </w:tcBorders>
-            <w:tcMar>
-              <w:top w:w="80" w:type="dxa"/>
-              <w:left w:w="140" w:type="dxa"/>
-              <w:bottom w:w="80" w:type="dxa"/>
-              <w:right w:w="100" w:type="dxa"/>
-            </w:tcMar>
-          </w:tcPr>
-          <w:p>
-            <w:pPr>
-              <w:spacing w:line="360" w:lineRule="auto"/>
-            </w:pPr>
-            <w:r>
-              <w:t>Consider adding diacritic-normalized search for better Vietnamese name matching.</w:t>
+            <w:tcW w:type="dxa" w:w="2755"/>
+          </w:tcPr>
+          <w:p>
+            <w:r>
+              <w:t>Consider adding diacritic-normalization or fuzzy matching.</w:t>
+            </w:r>
+          </w:p>
+        </w:tc>
+      </w:tr>
+      <w:tr>
+        <w:tc>
+          <w:tcPr>
+            <w:tcW w:type="dxa" w:w="2351"/>
+          </w:tcPr>
+          <w:p>
+            <w:r>
+              <w:t>ADMIN legacy account has no Member record</w:t>
+            </w:r>
+          </w:p>
+        </w:tc>
+        <w:tc>
+          <w:tcPr>
+            <w:tcW w:type="dxa" w:w="2945"/>
+          </w:tcPr>
+          <w:p>
+            <w:r>
+              <w:t>The auto-created ADMIN/ADMIN account from first-run bootstrap has no corresponding Member entry. Accessing profile view from this account fails.</w:t>
+            </w:r>
+          </w:p>
+        </w:tc>
+        <w:tc>
+          <w:tcPr>
+            <w:tcW w:type="dxa" w:w="975"/>
+          </w:tcPr>
+          <w:p>
+            <w:r>
+              <w:t>Low</w:t>
+            </w:r>
+          </w:p>
+        </w:tc>
+        <w:tc>
+          <w:tcPr>
+            <w:tcW w:type="dxa" w:w="2755"/>
+          </w:tcPr>
+          <w:p>
+            <w:r>
+              <w:t>Use SE203055 (Phuc@2006) for BCN access; ADMIN account kept for backward compatibility only.</w:t>
+            </w:r>
+          </w:p>
+        </w:tc>
+      </w:tr>
+      <w:tr>
+        <w:tc>
+          <w:tcPr>
+            <w:tcW w:type="dxa" w:w="2351"/>
+          </w:tcPr>
+          <w:p>
+            <w:r>
+              <w:t>Fixed-width columns may truncate long names</w:t>
+            </w:r>
+          </w:p>
+        </w:tc>
+        <w:tc>
+          <w:tcPr>
+            <w:tcW w:type="dxa" w:w="2945"/>
+          </w:tcPr>
+          <w:p>
+            <w:r>
+              <w:t>Member list uses fixed-width truncation (%-10.10s) for safety. Some Vietnamese names with diacritics may appear cut off.</w:t>
+            </w:r>
+          </w:p>
+        </w:tc>
+        <w:tc>
+          <w:tcPr>
+            <w:tcW w:type="dxa" w:w="975"/>
+          </w:tcPr>
+          <w:p>
+            <w:r>
+              <w:t>Low</w:t>
+            </w:r>
+          </w:p>
+        </w:tc>
+        <w:tc>
+          <w:tcPr>
+            <w:tcW w:type="dxa" w:w="2755"/>
+          </w:tcPr>
+          <w:p>
+            <w:r>
+              <w:t>Consider dynamic column sizing or wider default widths.</w:t>
             </w:r>
           </w:p>
         </w:tc>

</xml_diff>